<commit_message>
Documentacion: actualizar manuales (biblioteca, estudiantes y detallado) con importador Excel/CSV, disponibilidad en tiempo real y categoria del escaner QR
</commit_message>
<xml_diff>
--- a/MANUAL_COMEDOR.docx
+++ b/MANUAL_COMEDOR.docx
@@ -5,7 +5,7 @@
     <w:p>
       <w:pPr>
         <w:pStyle w:val="Ttulo1"/>
-        <w:divId w:val="1719090648"/>
+        <w:divId w:val="1795752509"/>
         <w:rPr>
           <w:rFonts w:ascii="Segoe UI" w:eastAsia="Times New Roman" w:hAnsi="Segoe UI" w:cs="Segoe UI"/>
           <w:lang w:val="es-ES"/>
@@ -22,7 +22,7 @@
     <w:p>
       <w:pPr>
         <w:pStyle w:val="NormalWeb"/>
-        <w:divId w:val="1719090648"/>
+        <w:divId w:val="1795752509"/>
         <w:rPr>
           <w:rFonts w:ascii="Segoe UI" w:hAnsi="Segoe UI" w:cs="Segoe UI"/>
           <w:color w:val="1A1A1A"/>
@@ -66,24 +66,24 @@
     <w:p>
       <w:pPr>
         <w:spacing w:before="360" w:after="360"/>
-        <w:divId w:val="1719090648"/>
-        <w:rPr>
-          <w:rFonts w:ascii="Segoe UI" w:eastAsia="Times New Roman" w:hAnsi="Segoe UI" w:cs="Segoe UI"/>
-          <w:color w:val="1A1A1A"/>
-          <w:sz w:val="23"/>
-          <w:szCs w:val="23"/>
-          <w:lang w:val="es-ES"/>
-        </w:rPr>
-      </w:pPr>
-      <w:r>
-        <w:rPr>
-          <w:rFonts w:ascii="Segoe UI" w:eastAsia="Times New Roman" w:hAnsi="Segoe UI" w:cs="Segoe UI"/>
-          <w:color w:val="1A1A1A"/>
-          <w:sz w:val="23"/>
-          <w:szCs w:val="23"/>
-          <w:lang w:val="es-ES"/>
-        </w:rPr>
-        <w:pict w14:anchorId="2BD018A0">
+        <w:divId w:val="1795752509"/>
+        <w:rPr>
+          <w:rFonts w:ascii="Segoe UI" w:eastAsia="Times New Roman" w:hAnsi="Segoe UI" w:cs="Segoe UI"/>
+          <w:color w:val="1A1A1A"/>
+          <w:sz w:val="23"/>
+          <w:szCs w:val="23"/>
+          <w:lang w:val="es-ES"/>
+        </w:rPr>
+      </w:pPr>
+      <w:r>
+        <w:rPr>
+          <w:rFonts w:ascii="Segoe UI" w:eastAsia="Times New Roman" w:hAnsi="Segoe UI" w:cs="Segoe UI"/>
+          <w:color w:val="1A1A1A"/>
+          <w:sz w:val="23"/>
+          <w:szCs w:val="23"/>
+          <w:lang w:val="es-ES"/>
+        </w:rPr>
+        <w:pict w14:anchorId="1D19E803">
           <v:rect id="_x0000_i1025" style="width:0;height:1.5pt" o:hralign="center" o:hrstd="t" o:hr="t" fillcolor="#a0a0a0" stroked="f"/>
         </w:pict>
       </w:r>
@@ -91,7 +91,7 @@
     <w:p>
       <w:pPr>
         <w:pStyle w:val="Ttulo2"/>
-        <w:divId w:val="1719090648"/>
+        <w:divId w:val="1795752509"/>
         <w:rPr>
           <w:rFonts w:ascii="Segoe UI" w:eastAsia="Times New Roman" w:hAnsi="Segoe UI" w:cs="Segoe UI"/>
           <w:lang w:val="es-ES"/>
@@ -108,7 +108,7 @@
     <w:p>
       <w:pPr>
         <w:pStyle w:val="NormalWeb"/>
-        <w:divId w:val="1719090648"/>
+        <w:divId w:val="1795752509"/>
         <w:rPr>
           <w:rFonts w:ascii="Segoe UI" w:hAnsi="Segoe UI" w:cs="Segoe UI"/>
           <w:color w:val="1A1A1A"/>
@@ -168,7 +168,7 @@
         </w:numPr>
         <w:spacing w:before="45" w:after="45"/>
         <w:ind w:left="810"/>
-        <w:divId w:val="1719090648"/>
+        <w:divId w:val="1795752509"/>
         <w:rPr>
           <w:rFonts w:ascii="Segoe UI" w:eastAsia="Times New Roman" w:hAnsi="Segoe UI" w:cs="Segoe UI"/>
           <w:color w:val="1A1A1A"/>
@@ -196,7 +196,7 @@
         </w:numPr>
         <w:spacing w:before="45" w:after="45"/>
         <w:ind w:left="810"/>
-        <w:divId w:val="1719090648"/>
+        <w:divId w:val="1795752509"/>
         <w:rPr>
           <w:rFonts w:ascii="Segoe UI" w:eastAsia="Times New Roman" w:hAnsi="Segoe UI" w:cs="Segoe UI"/>
           <w:color w:val="1A1A1A"/>
@@ -266,7 +266,7 @@
         </w:numPr>
         <w:spacing w:before="45" w:after="45"/>
         <w:ind w:left="810"/>
-        <w:divId w:val="1719090648"/>
+        <w:divId w:val="1795752509"/>
         <w:rPr>
           <w:rFonts w:ascii="Segoe UI" w:eastAsia="Times New Roman" w:hAnsi="Segoe UI" w:cs="Segoe UI"/>
           <w:color w:val="1A1A1A"/>
@@ -336,7 +336,7 @@
         </w:numPr>
         <w:spacing w:before="45" w:after="45"/>
         <w:ind w:left="810"/>
-        <w:divId w:val="1719090648"/>
+        <w:divId w:val="1795752509"/>
         <w:rPr>
           <w:rFonts w:ascii="Segoe UI" w:eastAsia="Times New Roman" w:hAnsi="Segoe UI" w:cs="Segoe UI"/>
           <w:color w:val="1A1A1A"/>
@@ -385,7 +385,7 @@
         </w:numPr>
         <w:spacing w:before="45" w:after="45"/>
         <w:ind w:left="810"/>
-        <w:divId w:val="1719090648"/>
+        <w:divId w:val="1795752509"/>
         <w:rPr>
           <w:rFonts w:ascii="Segoe UI" w:eastAsia="Times New Roman" w:hAnsi="Segoe UI" w:cs="Segoe UI"/>
           <w:color w:val="1A1A1A"/>
@@ -450,24 +450,24 @@
     <w:p>
       <w:pPr>
         <w:spacing w:before="360" w:after="360"/>
-        <w:divId w:val="1719090648"/>
-        <w:rPr>
-          <w:rFonts w:ascii="Segoe UI" w:eastAsia="Times New Roman" w:hAnsi="Segoe UI" w:cs="Segoe UI"/>
-          <w:color w:val="1A1A1A"/>
-          <w:sz w:val="23"/>
-          <w:szCs w:val="23"/>
-          <w:lang w:val="es-ES"/>
-        </w:rPr>
-      </w:pPr>
-      <w:r>
-        <w:rPr>
-          <w:rFonts w:ascii="Segoe UI" w:eastAsia="Times New Roman" w:hAnsi="Segoe UI" w:cs="Segoe UI"/>
-          <w:color w:val="1A1A1A"/>
-          <w:sz w:val="23"/>
-          <w:szCs w:val="23"/>
-          <w:lang w:val="es-ES"/>
-        </w:rPr>
-        <w:pict w14:anchorId="694D8538">
+        <w:divId w:val="1795752509"/>
+        <w:rPr>
+          <w:rFonts w:ascii="Segoe UI" w:eastAsia="Times New Roman" w:hAnsi="Segoe UI" w:cs="Segoe UI"/>
+          <w:color w:val="1A1A1A"/>
+          <w:sz w:val="23"/>
+          <w:szCs w:val="23"/>
+          <w:lang w:val="es-ES"/>
+        </w:rPr>
+      </w:pPr>
+      <w:r>
+        <w:rPr>
+          <w:rFonts w:ascii="Segoe UI" w:eastAsia="Times New Roman" w:hAnsi="Segoe UI" w:cs="Segoe UI"/>
+          <w:color w:val="1A1A1A"/>
+          <w:sz w:val="23"/>
+          <w:szCs w:val="23"/>
+          <w:lang w:val="es-ES"/>
+        </w:rPr>
+        <w:pict w14:anchorId="05E67FBA">
           <v:rect id="_x0000_i1026" style="width:0;height:1.5pt" o:hralign="center" o:hrstd="t" o:hr="t" fillcolor="#a0a0a0" stroked="f"/>
         </w:pict>
       </w:r>
@@ -475,7 +475,7 @@
     <w:p>
       <w:pPr>
         <w:pStyle w:val="Ttulo2"/>
-        <w:divId w:val="1719090648"/>
+        <w:divId w:val="1795752509"/>
         <w:rPr>
           <w:rFonts w:ascii="Segoe UI" w:eastAsia="Times New Roman" w:hAnsi="Segoe UI" w:cs="Segoe UI"/>
           <w:lang w:val="es-ES"/>
@@ -497,7 +497,7 @@
         </w:numPr>
         <w:spacing w:before="45" w:after="45"/>
         <w:ind w:left="810"/>
-        <w:divId w:val="1719090648"/>
+        <w:divId w:val="1795752509"/>
         <w:rPr>
           <w:rFonts w:ascii="Segoe UI" w:eastAsia="Times New Roman" w:hAnsi="Segoe UI" w:cs="Segoe UI"/>
           <w:color w:val="1A1A1A"/>
@@ -543,7 +543,7 @@
         </w:numPr>
         <w:spacing w:before="45" w:after="45"/>
         <w:ind w:left="810"/>
-        <w:divId w:val="1719090648"/>
+        <w:divId w:val="1795752509"/>
         <w:rPr>
           <w:rFonts w:ascii="Segoe UI" w:eastAsia="Times New Roman" w:hAnsi="Segoe UI" w:cs="Segoe UI"/>
           <w:color w:val="1A1A1A"/>
@@ -571,7 +571,7 @@
         </w:numPr>
         <w:spacing w:before="45" w:after="45"/>
         <w:ind w:left="810"/>
-        <w:divId w:val="1719090648"/>
+        <w:divId w:val="1795752509"/>
         <w:rPr>
           <w:rFonts w:ascii="Segoe UI" w:eastAsia="Times New Roman" w:hAnsi="Segoe UI" w:cs="Segoe UI"/>
           <w:color w:val="1A1A1A"/>
@@ -620,7 +620,7 @@
         </w:numPr>
         <w:spacing w:before="45" w:after="45"/>
         <w:ind w:left="810"/>
-        <w:divId w:val="1719090648"/>
+        <w:divId w:val="1795752509"/>
         <w:rPr>
           <w:rFonts w:ascii="Segoe UI" w:eastAsia="Times New Roman" w:hAnsi="Segoe UI" w:cs="Segoe UI"/>
           <w:color w:val="1A1A1A"/>
@@ -664,7 +664,7 @@
     <w:p>
       <w:pPr>
         <w:pStyle w:val="NormalWeb"/>
-        <w:divId w:val="1719090648"/>
+        <w:divId w:val="1795752509"/>
         <w:rPr>
           <w:rFonts w:ascii="Segoe UI" w:hAnsi="Segoe UI" w:cs="Segoe UI"/>
           <w:color w:val="1A1A1A"/>
@@ -708,24 +708,24 @@
     <w:p>
       <w:pPr>
         <w:spacing w:before="360" w:after="360"/>
-        <w:divId w:val="1719090648"/>
-        <w:rPr>
-          <w:rFonts w:ascii="Segoe UI" w:eastAsia="Times New Roman" w:hAnsi="Segoe UI" w:cs="Segoe UI"/>
-          <w:color w:val="1A1A1A"/>
-          <w:sz w:val="23"/>
-          <w:szCs w:val="23"/>
-          <w:lang w:val="es-ES"/>
-        </w:rPr>
-      </w:pPr>
-      <w:r>
-        <w:rPr>
-          <w:rFonts w:ascii="Segoe UI" w:eastAsia="Times New Roman" w:hAnsi="Segoe UI" w:cs="Segoe UI"/>
-          <w:color w:val="1A1A1A"/>
-          <w:sz w:val="23"/>
-          <w:szCs w:val="23"/>
-          <w:lang w:val="es-ES"/>
-        </w:rPr>
-        <w:pict w14:anchorId="5DFCA00A">
+        <w:divId w:val="1795752509"/>
+        <w:rPr>
+          <w:rFonts w:ascii="Segoe UI" w:eastAsia="Times New Roman" w:hAnsi="Segoe UI" w:cs="Segoe UI"/>
+          <w:color w:val="1A1A1A"/>
+          <w:sz w:val="23"/>
+          <w:szCs w:val="23"/>
+          <w:lang w:val="es-ES"/>
+        </w:rPr>
+      </w:pPr>
+      <w:r>
+        <w:rPr>
+          <w:rFonts w:ascii="Segoe UI" w:eastAsia="Times New Roman" w:hAnsi="Segoe UI" w:cs="Segoe UI"/>
+          <w:color w:val="1A1A1A"/>
+          <w:sz w:val="23"/>
+          <w:szCs w:val="23"/>
+          <w:lang w:val="es-ES"/>
+        </w:rPr>
+        <w:pict w14:anchorId="76BEC4BB">
           <v:rect id="_x0000_i1027" style="width:0;height:1.5pt" o:hralign="center" o:hrstd="t" o:hr="t" fillcolor="#a0a0a0" stroked="f"/>
         </w:pict>
       </w:r>
@@ -733,7 +733,7 @@
     <w:p>
       <w:pPr>
         <w:pStyle w:val="Ttulo2"/>
-        <w:divId w:val="1719090648"/>
+        <w:divId w:val="1795752509"/>
         <w:rPr>
           <w:rFonts w:ascii="Segoe UI" w:eastAsia="Times New Roman" w:hAnsi="Segoe UI" w:cs="Segoe UI"/>
           <w:lang w:val="es-ES"/>
@@ -756,7 +756,7 @@
         </w:numPr>
         <w:spacing w:before="45" w:after="45"/>
         <w:ind w:left="810"/>
-        <w:divId w:val="1719090648"/>
+        <w:divId w:val="1795752509"/>
         <w:rPr>
           <w:rFonts w:ascii="Segoe UI" w:eastAsia="Times New Roman" w:hAnsi="Segoe UI" w:cs="Segoe UI"/>
           <w:color w:val="1A1A1A"/>
@@ -795,7 +795,7 @@
         </w:numPr>
         <w:spacing w:before="45" w:after="45"/>
         <w:ind w:left="810"/>
-        <w:divId w:val="1719090648"/>
+        <w:divId w:val="1795752509"/>
         <w:rPr>
           <w:rFonts w:ascii="Segoe UI" w:eastAsia="Times New Roman" w:hAnsi="Segoe UI" w:cs="Segoe UI"/>
           <w:color w:val="1A1A1A"/>
@@ -865,7 +865,7 @@
         </w:numPr>
         <w:spacing w:before="45" w:after="45"/>
         <w:ind w:left="810"/>
-        <w:divId w:val="1719090648"/>
+        <w:divId w:val="1795752509"/>
         <w:rPr>
           <w:rFonts w:ascii="Segoe UI" w:eastAsia="Times New Roman" w:hAnsi="Segoe UI" w:cs="Segoe UI"/>
           <w:color w:val="1A1A1A"/>
@@ -899,24 +899,24 @@
     <w:p>
       <w:pPr>
         <w:spacing w:before="360" w:after="360"/>
-        <w:divId w:val="1719090648"/>
-        <w:rPr>
-          <w:rFonts w:ascii="Segoe UI" w:eastAsia="Times New Roman" w:hAnsi="Segoe UI" w:cs="Segoe UI"/>
-          <w:color w:val="1A1A1A"/>
-          <w:sz w:val="23"/>
-          <w:szCs w:val="23"/>
-          <w:lang w:val="es-ES"/>
-        </w:rPr>
-      </w:pPr>
-      <w:r>
-        <w:rPr>
-          <w:rFonts w:ascii="Segoe UI" w:eastAsia="Times New Roman" w:hAnsi="Segoe UI" w:cs="Segoe UI"/>
-          <w:color w:val="1A1A1A"/>
-          <w:sz w:val="23"/>
-          <w:szCs w:val="23"/>
-          <w:lang w:val="es-ES"/>
-        </w:rPr>
-        <w:pict w14:anchorId="3F9492A6">
+        <w:divId w:val="1795752509"/>
+        <w:rPr>
+          <w:rFonts w:ascii="Segoe UI" w:eastAsia="Times New Roman" w:hAnsi="Segoe UI" w:cs="Segoe UI"/>
+          <w:color w:val="1A1A1A"/>
+          <w:sz w:val="23"/>
+          <w:szCs w:val="23"/>
+          <w:lang w:val="es-ES"/>
+        </w:rPr>
+      </w:pPr>
+      <w:r>
+        <w:rPr>
+          <w:rFonts w:ascii="Segoe UI" w:eastAsia="Times New Roman" w:hAnsi="Segoe UI" w:cs="Segoe UI"/>
+          <w:color w:val="1A1A1A"/>
+          <w:sz w:val="23"/>
+          <w:szCs w:val="23"/>
+          <w:lang w:val="es-ES"/>
+        </w:rPr>
+        <w:pict w14:anchorId="0F8E22B0">
           <v:rect id="_x0000_i1028" style="width:0;height:1.5pt" o:hralign="center" o:hrstd="t" o:hr="t" fillcolor="#a0a0a0" stroked="f"/>
         </w:pict>
       </w:r>
@@ -924,7 +924,7 @@
     <w:p>
       <w:pPr>
         <w:pStyle w:val="Ttulo2"/>
-        <w:divId w:val="1719090648"/>
+        <w:divId w:val="1795752509"/>
         <w:rPr>
           <w:rFonts w:ascii="Segoe UI" w:eastAsia="Times New Roman" w:hAnsi="Segoe UI" w:cs="Segoe UI"/>
           <w:lang w:val="es-ES"/>
@@ -941,7 +941,7 @@
     <w:p>
       <w:pPr>
         <w:pStyle w:val="Ttulo3"/>
-        <w:divId w:val="1719090648"/>
+        <w:divId w:val="1795752509"/>
         <w:rPr>
           <w:rFonts w:ascii="Segoe UI" w:eastAsia="Times New Roman" w:hAnsi="Segoe UI" w:cs="Segoe UI"/>
           <w:lang w:val="es-ES"/>
@@ -958,7 +958,7 @@
     <w:p>
       <w:pPr>
         <w:pStyle w:val="NormalWeb"/>
-        <w:divId w:val="1719090648"/>
+        <w:divId w:val="1795752509"/>
         <w:rPr>
           <w:rFonts w:ascii="Segoe UI" w:hAnsi="Segoe UI" w:cs="Segoe UI"/>
           <w:color w:val="1A1A1A"/>
@@ -986,7 +986,7 @@
         </w:numPr>
         <w:spacing w:before="45" w:after="45"/>
         <w:ind w:left="810"/>
-        <w:divId w:val="1719090648"/>
+        <w:divId w:val="1795752509"/>
         <w:rPr>
           <w:rFonts w:ascii="Segoe UI" w:eastAsia="Times New Roman" w:hAnsi="Segoe UI" w:cs="Segoe UI"/>
           <w:color w:val="1A1A1A"/>
@@ -1035,7 +1035,7 @@
         </w:numPr>
         <w:spacing w:before="45" w:after="45"/>
         <w:ind w:left="810"/>
-        <w:divId w:val="1719090648"/>
+        <w:divId w:val="1795752509"/>
         <w:rPr>
           <w:rFonts w:ascii="Segoe UI" w:eastAsia="Times New Roman" w:hAnsi="Segoe UI" w:cs="Segoe UI"/>
           <w:color w:val="1A1A1A"/>
@@ -1074,7 +1074,7 @@
         </w:numPr>
         <w:spacing w:before="45" w:after="45"/>
         <w:ind w:left="810"/>
-        <w:divId w:val="1719090648"/>
+        <w:divId w:val="1795752509"/>
         <w:rPr>
           <w:rFonts w:ascii="Segoe UI" w:eastAsia="Times New Roman" w:hAnsi="Segoe UI" w:cs="Segoe UI"/>
           <w:color w:val="1A1A1A"/>
@@ -1113,7 +1113,7 @@
         </w:numPr>
         <w:spacing w:before="45" w:after="45"/>
         <w:ind w:left="810"/>
-        <w:divId w:val="1719090648"/>
+        <w:divId w:val="1795752509"/>
         <w:rPr>
           <w:rFonts w:ascii="Segoe UI" w:eastAsia="Times New Roman" w:hAnsi="Segoe UI" w:cs="Segoe UI"/>
           <w:color w:val="1A1A1A"/>
@@ -1136,7 +1136,7 @@
     <w:p>
       <w:pPr>
         <w:pStyle w:val="Ttulo3"/>
-        <w:divId w:val="1719090648"/>
+        <w:divId w:val="1795752509"/>
         <w:rPr>
           <w:rFonts w:ascii="Segoe UI" w:eastAsia="Times New Roman" w:hAnsi="Segoe UI" w:cs="Segoe UI"/>
           <w:lang w:val="es-ES"/>
@@ -1153,7 +1153,7 @@
     <w:p>
       <w:pPr>
         <w:pStyle w:val="Ttulo4"/>
-        <w:divId w:val="1719090648"/>
+        <w:divId w:val="1795752509"/>
         <w:rPr>
           <w:rFonts w:ascii="Segoe UI" w:eastAsia="Times New Roman" w:hAnsi="Segoe UI" w:cs="Segoe UI"/>
           <w:lang w:val="es-ES"/>
@@ -1175,7 +1175,7 @@
         </w:numPr>
         <w:spacing w:before="45" w:after="45"/>
         <w:ind w:left="810"/>
-        <w:divId w:val="1719090648"/>
+        <w:divId w:val="1795752509"/>
         <w:rPr>
           <w:rFonts w:ascii="Segoe UI" w:eastAsia="Times New Roman" w:hAnsi="Segoe UI" w:cs="Segoe UI"/>
           <w:color w:val="1A1A1A"/>
@@ -1224,7 +1224,7 @@
         </w:numPr>
         <w:spacing w:before="45" w:after="45"/>
         <w:ind w:left="810"/>
-        <w:divId w:val="1719090648"/>
+        <w:divId w:val="1795752509"/>
         <w:rPr>
           <w:rFonts w:ascii="Segoe UI" w:eastAsia="Times New Roman" w:hAnsi="Segoe UI" w:cs="Segoe UI"/>
           <w:color w:val="1A1A1A"/>
@@ -1252,7 +1252,7 @@
         </w:numPr>
         <w:spacing w:before="45" w:after="45"/>
         <w:ind w:left="810"/>
-        <w:divId w:val="1719090648"/>
+        <w:divId w:val="1795752509"/>
         <w:rPr>
           <w:rFonts w:ascii="Segoe UI" w:eastAsia="Times New Roman" w:hAnsi="Segoe UI" w:cs="Segoe UI"/>
           <w:color w:val="1A1A1A"/>
@@ -1338,7 +1338,7 @@
     <w:p>
       <w:pPr>
         <w:pStyle w:val="Ttulo4"/>
-        <w:divId w:val="1719090648"/>
+        <w:divId w:val="1795752509"/>
         <w:rPr>
           <w:rFonts w:ascii="Segoe UI" w:eastAsia="Times New Roman" w:hAnsi="Segoe UI" w:cs="Segoe UI"/>
           <w:lang w:val="es-ES"/>
@@ -1360,7 +1360,7 @@
         </w:numPr>
         <w:spacing w:before="45" w:after="45"/>
         <w:ind w:left="810"/>
-        <w:divId w:val="1719090648"/>
+        <w:divId w:val="1795752509"/>
         <w:rPr>
           <w:rFonts w:ascii="Segoe UI" w:eastAsia="Times New Roman" w:hAnsi="Segoe UI" w:cs="Segoe UI"/>
           <w:color w:val="1A1A1A"/>
@@ -1409,7 +1409,7 @@
         </w:numPr>
         <w:spacing w:before="45" w:after="45"/>
         <w:ind w:left="810"/>
-        <w:divId w:val="1719090648"/>
+        <w:divId w:val="1795752509"/>
         <w:rPr>
           <w:rFonts w:ascii="Segoe UI" w:eastAsia="Times New Roman" w:hAnsi="Segoe UI" w:cs="Segoe UI"/>
           <w:color w:val="1A1A1A"/>
@@ -1542,7 +1542,7 @@
         </w:numPr>
         <w:spacing w:before="45" w:after="45"/>
         <w:ind w:left="810"/>
-        <w:divId w:val="1719090648"/>
+        <w:divId w:val="1795752509"/>
         <w:rPr>
           <w:rFonts w:ascii="Segoe UI" w:eastAsia="Times New Roman" w:hAnsi="Segoe UI" w:cs="Segoe UI"/>
           <w:color w:val="1A1A1A"/>
@@ -1591,7 +1591,7 @@
         </w:numPr>
         <w:spacing w:before="45" w:after="45"/>
         <w:ind w:left="810"/>
-        <w:divId w:val="1719090648"/>
+        <w:divId w:val="1795752509"/>
         <w:rPr>
           <w:rFonts w:ascii="Segoe UI" w:eastAsia="Times New Roman" w:hAnsi="Segoe UI" w:cs="Segoe UI"/>
           <w:color w:val="1A1A1A"/>
@@ -1661,7 +1661,7 @@
         </w:numPr>
         <w:spacing w:before="45" w:after="45"/>
         <w:ind w:left="810"/>
-        <w:divId w:val="1719090648"/>
+        <w:divId w:val="1795752509"/>
         <w:rPr>
           <w:rFonts w:ascii="Segoe UI" w:eastAsia="Times New Roman" w:hAnsi="Segoe UI" w:cs="Segoe UI"/>
           <w:color w:val="1A1A1A"/>
@@ -1705,7 +1705,7 @@
     <w:p>
       <w:pPr>
         <w:pStyle w:val="NormalWeb"/>
-        <w:divId w:val="1719090648"/>
+        <w:divId w:val="1795752509"/>
         <w:rPr>
           <w:rFonts w:ascii="Segoe UI" w:hAnsi="Segoe UI" w:cs="Segoe UI"/>
           <w:color w:val="1A1A1A"/>
@@ -1750,8 +1750,7 @@
     <w:p>
       <w:pPr>
         <w:shd w:val="clear" w:color="auto" w:fill="F2F4F8"/>
-        <w:spacing w:before="180" w:after="180"/>
-        <w:divId w:val="102263587"/>
+        <w:divId w:val="442724407"/>
         <w:rPr>
           <w:rFonts w:ascii="Segoe UI" w:eastAsia="Times New Roman" w:hAnsi="Segoe UI" w:cs="Segoe UI"/>
           <w:color w:val="333333"/>
@@ -1774,7 +1773,7 @@
     <w:p>
       <w:pPr>
         <w:pStyle w:val="Ttulo4"/>
-        <w:divId w:val="1719090648"/>
+        <w:divId w:val="1795752509"/>
         <w:rPr>
           <w:rFonts w:ascii="Segoe UI" w:eastAsia="Times New Roman" w:hAnsi="Segoe UI" w:cs="Segoe UI"/>
           <w:lang w:val="es-ES"/>
@@ -1791,7 +1790,7 @@
     <w:p>
       <w:pPr>
         <w:pStyle w:val="NormalWeb"/>
-        <w:divId w:val="1719090648"/>
+        <w:divId w:val="1795752509"/>
         <w:rPr>
           <w:rFonts w:ascii="Segoe UI" w:hAnsi="Segoe UI" w:cs="Segoe UI"/>
           <w:color w:val="1A1A1A"/>
@@ -1866,7 +1865,7 @@
     <w:p>
       <w:pPr>
         <w:pStyle w:val="Ttulo4"/>
-        <w:divId w:val="1719090648"/>
+        <w:divId w:val="1795752509"/>
         <w:rPr>
           <w:rFonts w:ascii="Segoe UI" w:eastAsia="Times New Roman" w:hAnsi="Segoe UI" w:cs="Segoe UI"/>
           <w:lang w:val="es-ES"/>
@@ -1883,7 +1882,7 @@
     <w:p>
       <w:pPr>
         <w:pStyle w:val="NormalWeb"/>
-        <w:divId w:val="1719090648"/>
+        <w:divId w:val="1795752509"/>
         <w:rPr>
           <w:rFonts w:ascii="Segoe UI" w:hAnsi="Segoe UI" w:cs="Segoe UI"/>
           <w:color w:val="1A1A1A"/>
@@ -1938,7 +1937,7 @@
     <w:p>
       <w:pPr>
         <w:pStyle w:val="Ttulo4"/>
-        <w:divId w:val="1719090648"/>
+        <w:divId w:val="1795752509"/>
         <w:rPr>
           <w:rFonts w:ascii="Segoe UI" w:eastAsia="Times New Roman" w:hAnsi="Segoe UI" w:cs="Segoe UI"/>
           <w:lang w:val="es-ES"/>
@@ -1960,7 +1959,7 @@
         </w:numPr>
         <w:spacing w:before="45" w:after="45"/>
         <w:ind w:left="810"/>
-        <w:divId w:val="1719090648"/>
+        <w:divId w:val="1795752509"/>
         <w:rPr>
           <w:rFonts w:ascii="Segoe UI" w:eastAsia="Times New Roman" w:hAnsi="Segoe UI" w:cs="Segoe UI"/>
           <w:color w:val="1A1A1A"/>
@@ -2009,7 +2008,7 @@
         </w:numPr>
         <w:spacing w:before="45" w:after="45"/>
         <w:ind w:left="810"/>
-        <w:divId w:val="1719090648"/>
+        <w:divId w:val="1795752509"/>
         <w:rPr>
           <w:rFonts w:ascii="Segoe UI" w:eastAsia="Times New Roman" w:hAnsi="Segoe UI" w:cs="Segoe UI"/>
           <w:color w:val="1A1A1A"/>
@@ -2037,7 +2036,7 @@
         </w:numPr>
         <w:spacing w:before="45" w:after="45"/>
         <w:ind w:left="810"/>
-        <w:divId w:val="1719090648"/>
+        <w:divId w:val="1795752509"/>
         <w:rPr>
           <w:rFonts w:ascii="Segoe UI" w:eastAsia="Times New Roman" w:hAnsi="Segoe UI" w:cs="Segoe UI"/>
           <w:color w:val="1A1A1A"/>
@@ -2065,7 +2064,7 @@
         </w:numPr>
         <w:spacing w:before="45" w:after="45"/>
         <w:ind w:left="810"/>
-        <w:divId w:val="1719090648"/>
+        <w:divId w:val="1795752509"/>
         <w:rPr>
           <w:rFonts w:ascii="Segoe UI" w:eastAsia="Times New Roman" w:hAnsi="Segoe UI" w:cs="Segoe UI"/>
           <w:color w:val="1A1A1A"/>
@@ -2088,7 +2087,7 @@
     <w:p>
       <w:pPr>
         <w:pStyle w:val="Ttulo3"/>
-        <w:divId w:val="1719090648"/>
+        <w:divId w:val="1795752509"/>
         <w:rPr>
           <w:rFonts w:ascii="Segoe UI" w:eastAsia="Times New Roman" w:hAnsi="Segoe UI" w:cs="Segoe UI"/>
           <w:lang w:val="es-ES"/>
@@ -2110,7 +2109,7 @@
         </w:numPr>
         <w:spacing w:before="45" w:after="45"/>
         <w:ind w:left="810"/>
-        <w:divId w:val="1719090648"/>
+        <w:divId w:val="1795752509"/>
         <w:rPr>
           <w:rFonts w:ascii="Segoe UI" w:eastAsia="Times New Roman" w:hAnsi="Segoe UI" w:cs="Segoe UI"/>
           <w:color w:val="1A1A1A"/>
@@ -2159,7 +2158,7 @@
         </w:numPr>
         <w:spacing w:before="45" w:after="45"/>
         <w:ind w:left="810"/>
-        <w:divId w:val="1719090648"/>
+        <w:divId w:val="1795752509"/>
         <w:rPr>
           <w:rFonts w:ascii="Segoe UI" w:eastAsia="Times New Roman" w:hAnsi="Segoe UI" w:cs="Segoe UI"/>
           <w:color w:val="1A1A1A"/>
@@ -2198,7 +2197,7 @@
         </w:numPr>
         <w:spacing w:before="45" w:after="45"/>
         <w:ind w:left="810"/>
-        <w:divId w:val="1719090648"/>
+        <w:divId w:val="1795752509"/>
         <w:rPr>
           <w:rFonts w:ascii="Segoe UI" w:eastAsia="Times New Roman" w:hAnsi="Segoe UI" w:cs="Segoe UI"/>
           <w:color w:val="1A1A1A"/>
@@ -2257,7 +2256,7 @@
         </w:numPr>
         <w:spacing w:before="45" w:after="45"/>
         <w:ind w:left="810"/>
-        <w:divId w:val="1719090648"/>
+        <w:divId w:val="1795752509"/>
         <w:rPr>
           <w:rFonts w:ascii="Segoe UI" w:eastAsia="Times New Roman" w:hAnsi="Segoe UI" w:cs="Segoe UI"/>
           <w:color w:val="1A1A1A"/>
@@ -2306,7 +2305,7 @@
         </w:numPr>
         <w:spacing w:before="45" w:after="45"/>
         <w:ind w:left="810"/>
-        <w:divId w:val="1719090648"/>
+        <w:divId w:val="1795752509"/>
         <w:rPr>
           <w:rFonts w:ascii="Segoe UI" w:eastAsia="Times New Roman" w:hAnsi="Segoe UI" w:cs="Segoe UI"/>
           <w:color w:val="1A1A1A"/>
@@ -2350,7 +2349,7 @@
     <w:p>
       <w:pPr>
         <w:pStyle w:val="NormalWeb"/>
-        <w:divId w:val="1719090648"/>
+        <w:divId w:val="1795752509"/>
         <w:rPr>
           <w:rFonts w:ascii="Segoe UI" w:hAnsi="Segoe UI" w:cs="Segoe UI"/>
           <w:color w:val="1A1A1A"/>
@@ -2379,7 +2378,7 @@
         </w:numPr>
         <w:spacing w:before="45" w:after="45"/>
         <w:ind w:left="810"/>
-        <w:divId w:val="1719090648"/>
+        <w:divId w:val="1795752509"/>
         <w:rPr>
           <w:rFonts w:ascii="Segoe UI" w:eastAsia="Times New Roman" w:hAnsi="Segoe UI" w:cs="Segoe UI"/>
           <w:color w:val="1A1A1A"/>
@@ -2407,7 +2406,7 @@
         </w:numPr>
         <w:spacing w:before="45" w:after="45"/>
         <w:ind w:left="810"/>
-        <w:divId w:val="1719090648"/>
+        <w:divId w:val="1795752509"/>
         <w:rPr>
           <w:rFonts w:ascii="Segoe UI" w:eastAsia="Times New Roman" w:hAnsi="Segoe UI" w:cs="Segoe UI"/>
           <w:color w:val="1A1A1A"/>
@@ -2430,7 +2429,7 @@
     <w:p>
       <w:pPr>
         <w:pStyle w:val="Ttulo3"/>
-        <w:divId w:val="1719090648"/>
+        <w:divId w:val="1795752509"/>
         <w:rPr>
           <w:rFonts w:ascii="Segoe UI" w:eastAsia="Times New Roman" w:hAnsi="Segoe UI" w:cs="Segoe UI"/>
           <w:lang w:val="es-ES"/>
@@ -2452,7 +2451,7 @@
         </w:numPr>
         <w:spacing w:before="45" w:after="45"/>
         <w:ind w:left="810"/>
-        <w:divId w:val="1719090648"/>
+        <w:divId w:val="1795752509"/>
         <w:rPr>
           <w:rFonts w:ascii="Segoe UI" w:eastAsia="Times New Roman" w:hAnsi="Segoe UI" w:cs="Segoe UI"/>
           <w:color w:val="1A1A1A"/>
@@ -2491,7 +2490,7 @@
         </w:numPr>
         <w:spacing w:before="45" w:after="45"/>
         <w:ind w:left="810"/>
-        <w:divId w:val="1719090648"/>
+        <w:divId w:val="1795752509"/>
         <w:rPr>
           <w:rFonts w:ascii="Segoe UI" w:eastAsia="Times New Roman" w:hAnsi="Segoe UI" w:cs="Segoe UI"/>
           <w:color w:val="1A1A1A"/>
@@ -2525,7 +2524,7 @@
     <w:p>
       <w:pPr>
         <w:pStyle w:val="Ttulo3"/>
-        <w:divId w:val="1719090648"/>
+        <w:divId w:val="1795752509"/>
         <w:rPr>
           <w:rFonts w:ascii="Segoe UI" w:eastAsia="Times New Roman" w:hAnsi="Segoe UI" w:cs="Segoe UI"/>
           <w:lang w:val="es-ES"/>
@@ -2542,7 +2541,7 @@
     <w:p>
       <w:pPr>
         <w:pStyle w:val="NormalWeb"/>
-        <w:divId w:val="1719090648"/>
+        <w:divId w:val="1795752509"/>
         <w:rPr>
           <w:rFonts w:ascii="Segoe UI" w:hAnsi="Segoe UI" w:cs="Segoe UI"/>
           <w:color w:val="1A1A1A"/>
@@ -2591,7 +2590,7 @@
         </w:numPr>
         <w:spacing w:before="45" w:after="45"/>
         <w:ind w:left="810"/>
-        <w:divId w:val="1719090648"/>
+        <w:divId w:val="1795752509"/>
         <w:rPr>
           <w:rFonts w:ascii="Segoe UI" w:eastAsia="Times New Roman" w:hAnsi="Segoe UI" w:cs="Segoe UI"/>
           <w:color w:val="1A1A1A"/>
@@ -2640,7 +2639,7 @@
         </w:numPr>
         <w:spacing w:before="45" w:after="45"/>
         <w:ind w:left="810"/>
-        <w:divId w:val="1719090648"/>
+        <w:divId w:val="1795752509"/>
         <w:rPr>
           <w:rFonts w:ascii="Segoe UI" w:eastAsia="Times New Roman" w:hAnsi="Segoe UI" w:cs="Segoe UI"/>
           <w:color w:val="1A1A1A"/>
@@ -2689,7 +2688,7 @@
         </w:numPr>
         <w:spacing w:before="45" w:after="45"/>
         <w:ind w:left="810"/>
-        <w:divId w:val="1719090648"/>
+        <w:divId w:val="1795752509"/>
         <w:rPr>
           <w:rFonts w:ascii="Segoe UI" w:eastAsia="Times New Roman" w:hAnsi="Segoe UI" w:cs="Segoe UI"/>
           <w:color w:val="1A1A1A"/>
@@ -2717,7 +2716,7 @@
         </w:numPr>
         <w:spacing w:before="45" w:after="45"/>
         <w:ind w:left="810"/>
-        <w:divId w:val="1719090648"/>
+        <w:divId w:val="1795752509"/>
         <w:rPr>
           <w:rFonts w:ascii="Segoe UI" w:eastAsia="Times New Roman" w:hAnsi="Segoe UI" w:cs="Segoe UI"/>
           <w:color w:val="1A1A1A"/>
@@ -2766,7 +2765,7 @@
         </w:numPr>
         <w:spacing w:before="45" w:after="45"/>
         <w:ind w:left="810"/>
-        <w:divId w:val="1719090648"/>
+        <w:divId w:val="1795752509"/>
         <w:rPr>
           <w:rFonts w:ascii="Segoe UI" w:eastAsia="Times New Roman" w:hAnsi="Segoe UI" w:cs="Segoe UI"/>
           <w:color w:val="1A1A1A"/>
@@ -2794,7 +2793,7 @@
         </w:numPr>
         <w:spacing w:before="45" w:after="45"/>
         <w:ind w:left="810"/>
-        <w:divId w:val="1719090648"/>
+        <w:divId w:val="1795752509"/>
         <w:rPr>
           <w:rFonts w:ascii="Segoe UI" w:eastAsia="Times New Roman" w:hAnsi="Segoe UI" w:cs="Segoe UI"/>
           <w:color w:val="1A1A1A"/>
@@ -2859,7 +2858,7 @@
     <w:p>
       <w:pPr>
         <w:pStyle w:val="Ttulo3"/>
-        <w:divId w:val="1719090648"/>
+        <w:divId w:val="1795752509"/>
         <w:rPr>
           <w:rFonts w:ascii="Segoe UI" w:eastAsia="Times New Roman" w:hAnsi="Segoe UI" w:cs="Segoe UI"/>
           <w:lang w:val="es-ES"/>
@@ -2881,7 +2880,7 @@
         </w:numPr>
         <w:spacing w:before="45" w:after="45"/>
         <w:ind w:left="810"/>
-        <w:divId w:val="1719090648"/>
+        <w:divId w:val="1795752509"/>
         <w:rPr>
           <w:rFonts w:ascii="Segoe UI" w:eastAsia="Times New Roman" w:hAnsi="Segoe UI" w:cs="Segoe UI"/>
           <w:color w:val="1A1A1A"/>
@@ -2930,7 +2929,7 @@
         </w:numPr>
         <w:spacing w:before="45" w:after="45"/>
         <w:ind w:left="810"/>
-        <w:divId w:val="1719090648"/>
+        <w:divId w:val="1795752509"/>
         <w:rPr>
           <w:rFonts w:ascii="Segoe UI" w:eastAsia="Times New Roman" w:hAnsi="Segoe UI" w:cs="Segoe UI"/>
           <w:color w:val="1A1A1A"/>
@@ -3000,7 +2999,7 @@
         </w:numPr>
         <w:spacing w:before="45" w:after="45"/>
         <w:ind w:left="810"/>
-        <w:divId w:val="1719090648"/>
+        <w:divId w:val="1795752509"/>
         <w:rPr>
           <w:rFonts w:ascii="Segoe UI" w:eastAsia="Times New Roman" w:hAnsi="Segoe UI" w:cs="Segoe UI"/>
           <w:color w:val="1A1A1A"/>
@@ -3044,7 +3043,7 @@
     <w:p>
       <w:pPr>
         <w:pStyle w:val="NormalWeb"/>
-        <w:divId w:val="1719090648"/>
+        <w:divId w:val="1795752509"/>
         <w:rPr>
           <w:rFonts w:ascii="Segoe UI" w:hAnsi="Segoe UI" w:cs="Segoe UI"/>
           <w:color w:val="1A1A1A"/>
@@ -3088,7 +3087,7 @@
     <w:p>
       <w:pPr>
         <w:pStyle w:val="Ttulo4"/>
-        <w:divId w:val="1719090648"/>
+        <w:divId w:val="1795752509"/>
         <w:rPr>
           <w:rFonts w:ascii="Segoe UI" w:eastAsia="Times New Roman" w:hAnsi="Segoe UI" w:cs="Segoe UI"/>
           <w:lang w:val="es-ES"/>
@@ -3110,7 +3109,7 @@
         </w:numPr>
         <w:spacing w:before="45" w:after="45"/>
         <w:ind w:left="810"/>
-        <w:divId w:val="1719090648"/>
+        <w:divId w:val="1795752509"/>
         <w:rPr>
           <w:rFonts w:ascii="Segoe UI" w:eastAsia="Times New Roman" w:hAnsi="Segoe UI" w:cs="Segoe UI"/>
           <w:color w:val="1A1A1A"/>
@@ -3159,7 +3158,7 @@
         </w:numPr>
         <w:spacing w:before="45" w:after="45"/>
         <w:ind w:left="810"/>
-        <w:divId w:val="1719090648"/>
+        <w:divId w:val="1795752509"/>
         <w:rPr>
           <w:rFonts w:ascii="Segoe UI" w:eastAsia="Times New Roman" w:hAnsi="Segoe UI" w:cs="Segoe UI"/>
           <w:color w:val="1A1A1A"/>
@@ -3208,7 +3207,7 @@
         </w:numPr>
         <w:spacing w:before="45" w:after="45"/>
         <w:ind w:left="810"/>
-        <w:divId w:val="1719090648"/>
+        <w:divId w:val="1795752509"/>
         <w:rPr>
           <w:rFonts w:ascii="Segoe UI" w:eastAsia="Times New Roman" w:hAnsi="Segoe UI" w:cs="Segoe UI"/>
           <w:color w:val="1A1A1A"/>
@@ -3236,7 +3235,7 @@
         </w:numPr>
         <w:spacing w:before="45" w:after="45"/>
         <w:ind w:left="810"/>
-        <w:divId w:val="1719090648"/>
+        <w:divId w:val="1795752509"/>
         <w:rPr>
           <w:rFonts w:ascii="Segoe UI" w:eastAsia="Times New Roman" w:hAnsi="Segoe UI" w:cs="Segoe UI"/>
           <w:color w:val="1A1A1A"/>
@@ -3260,7 +3259,7 @@
       <w:pPr>
         <w:shd w:val="clear" w:color="auto" w:fill="F2F4F8"/>
         <w:spacing w:before="180" w:after="180"/>
-        <w:divId w:val="124352887"/>
+        <w:divId w:val="2004777711"/>
         <w:rPr>
           <w:rFonts w:ascii="Segoe UI" w:eastAsia="Times New Roman" w:hAnsi="Segoe UI" w:cs="Segoe UI"/>
           <w:color w:val="333333"/>
@@ -3304,7 +3303,7 @@
     <w:p>
       <w:pPr>
         <w:pStyle w:val="Ttulo3"/>
-        <w:divId w:val="1719090648"/>
+        <w:divId w:val="1795752509"/>
         <w:rPr>
           <w:rFonts w:ascii="Segoe UI" w:eastAsia="Times New Roman" w:hAnsi="Segoe UI" w:cs="Segoe UI"/>
           <w:lang w:val="es-ES"/>
@@ -3326,7 +3325,7 @@
         </w:numPr>
         <w:spacing w:before="45" w:after="45"/>
         <w:ind w:left="810"/>
-        <w:divId w:val="1719090648"/>
+        <w:divId w:val="1795752509"/>
         <w:rPr>
           <w:rFonts w:ascii="Segoe UI" w:eastAsia="Times New Roman" w:hAnsi="Segoe UI" w:cs="Segoe UI"/>
           <w:color w:val="1A1A1A"/>
@@ -3375,7 +3374,7 @@
         </w:numPr>
         <w:spacing w:before="45" w:after="45"/>
         <w:ind w:left="810"/>
-        <w:divId w:val="1719090648"/>
+        <w:divId w:val="1795752509"/>
         <w:rPr>
           <w:rFonts w:ascii="Segoe UI" w:eastAsia="Times New Roman" w:hAnsi="Segoe UI" w:cs="Segoe UI"/>
           <w:color w:val="1A1A1A"/>
@@ -3403,7 +3402,7 @@
         </w:numPr>
         <w:spacing w:before="45" w:after="45"/>
         <w:ind w:left="810"/>
-        <w:divId w:val="1719090648"/>
+        <w:divId w:val="1795752509"/>
         <w:rPr>
           <w:rFonts w:ascii="Segoe UI" w:eastAsia="Times New Roman" w:hAnsi="Segoe UI" w:cs="Segoe UI"/>
           <w:color w:val="1A1A1A"/>
@@ -3426,7 +3425,7 @@
     <w:p>
       <w:pPr>
         <w:pStyle w:val="Ttulo3"/>
-        <w:divId w:val="1719090648"/>
+        <w:divId w:val="1795752509"/>
         <w:rPr>
           <w:rFonts w:ascii="Segoe UI" w:eastAsia="Times New Roman" w:hAnsi="Segoe UI" w:cs="Segoe UI"/>
           <w:lang w:val="es-ES"/>
@@ -3443,7 +3442,7 @@
     <w:p>
       <w:pPr>
         <w:pStyle w:val="NormalWeb"/>
-        <w:divId w:val="1719090648"/>
+        <w:divId w:val="1795752509"/>
         <w:rPr>
           <w:rFonts w:ascii="Segoe UI" w:hAnsi="Segoe UI" w:cs="Segoe UI"/>
           <w:color w:val="1A1A1A"/>
@@ -3529,7 +3528,7 @@
     <w:p>
       <w:pPr>
         <w:pStyle w:val="Ttulo3"/>
-        <w:divId w:val="1719090648"/>
+        <w:divId w:val="1795752509"/>
         <w:rPr>
           <w:rFonts w:ascii="Segoe UI" w:eastAsia="Times New Roman" w:hAnsi="Segoe UI" w:cs="Segoe UI"/>
           <w:lang w:val="es-ES"/>
@@ -3551,7 +3550,7 @@
         </w:numPr>
         <w:spacing w:before="45" w:after="45"/>
         <w:ind w:left="810"/>
-        <w:divId w:val="1719090648"/>
+        <w:divId w:val="1795752509"/>
         <w:rPr>
           <w:rFonts w:ascii="Segoe UI" w:eastAsia="Times New Roman" w:hAnsi="Segoe UI" w:cs="Segoe UI"/>
           <w:color w:val="1A1A1A"/>
@@ -3600,7 +3599,7 @@
         </w:numPr>
         <w:spacing w:before="45" w:after="45"/>
         <w:ind w:left="810"/>
-        <w:divId w:val="1719090648"/>
+        <w:divId w:val="1795752509"/>
         <w:rPr>
           <w:rFonts w:ascii="Segoe UI" w:eastAsia="Times New Roman" w:hAnsi="Segoe UI" w:cs="Segoe UI"/>
           <w:color w:val="1A1A1A"/>
@@ -3628,7 +3627,7 @@
         </w:numPr>
         <w:spacing w:before="45" w:after="45"/>
         <w:ind w:left="810"/>
-        <w:divId w:val="1719090648"/>
+        <w:divId w:val="1795752509"/>
         <w:rPr>
           <w:rFonts w:ascii="Segoe UI" w:eastAsia="Times New Roman" w:hAnsi="Segoe UI" w:cs="Segoe UI"/>
           <w:color w:val="1A1A1A"/>
@@ -3719,7 +3718,7 @@
         </w:numPr>
         <w:spacing w:before="45" w:after="45"/>
         <w:ind w:left="810"/>
-        <w:divId w:val="1719090648"/>
+        <w:divId w:val="1795752509"/>
         <w:rPr>
           <w:rFonts w:ascii="Segoe UI" w:eastAsia="Times New Roman" w:hAnsi="Segoe UI" w:cs="Segoe UI"/>
           <w:color w:val="1A1A1A"/>
@@ -3763,7 +3762,7 @@
     <w:p>
       <w:pPr>
         <w:pStyle w:val="Ttulo3"/>
-        <w:divId w:val="1719090648"/>
+        <w:divId w:val="1795752509"/>
         <w:rPr>
           <w:rFonts w:ascii="Segoe UI" w:eastAsia="Times New Roman" w:hAnsi="Segoe UI" w:cs="Segoe UI"/>
           <w:lang w:val="es-ES"/>
@@ -3780,7 +3779,7 @@
     <w:p>
       <w:pPr>
         <w:pStyle w:val="NormalWeb"/>
-        <w:divId w:val="1719090648"/>
+        <w:divId w:val="1795752509"/>
         <w:rPr>
           <w:rFonts w:ascii="Segoe UI" w:hAnsi="Segoe UI" w:cs="Segoe UI"/>
           <w:color w:val="1A1A1A"/>
@@ -3808,7 +3807,7 @@
         </w:numPr>
         <w:spacing w:before="45" w:after="45"/>
         <w:ind w:left="810"/>
-        <w:divId w:val="1719090648"/>
+        <w:divId w:val="1795752509"/>
         <w:rPr>
           <w:rFonts w:ascii="Segoe UI" w:eastAsia="Times New Roman" w:hAnsi="Segoe UI" w:cs="Segoe UI"/>
           <w:color w:val="1A1A1A"/>
@@ -3847,7 +3846,7 @@
         </w:numPr>
         <w:spacing w:before="45" w:after="45"/>
         <w:ind w:left="810"/>
-        <w:divId w:val="1719090648"/>
+        <w:divId w:val="1795752509"/>
         <w:rPr>
           <w:rFonts w:ascii="Segoe UI" w:eastAsia="Times New Roman" w:hAnsi="Segoe UI" w:cs="Segoe UI"/>
           <w:color w:val="1A1A1A"/>
@@ -3886,7 +3885,7 @@
         </w:numPr>
         <w:spacing w:before="45" w:after="45"/>
         <w:ind w:left="810"/>
-        <w:divId w:val="1719090648"/>
+        <w:divId w:val="1795752509"/>
         <w:rPr>
           <w:rFonts w:ascii="Segoe UI" w:eastAsia="Times New Roman" w:hAnsi="Segoe UI" w:cs="Segoe UI"/>
           <w:color w:val="1A1A1A"/>
@@ -3925,7 +3924,7 @@
         </w:numPr>
         <w:spacing w:before="45" w:after="45"/>
         <w:ind w:left="810"/>
-        <w:divId w:val="1719090648"/>
+        <w:divId w:val="1795752509"/>
         <w:rPr>
           <w:rFonts w:ascii="Segoe UI" w:eastAsia="Times New Roman" w:hAnsi="Segoe UI" w:cs="Segoe UI"/>
           <w:color w:val="1A1A1A"/>
@@ -3959,7 +3958,7 @@
     <w:p>
       <w:pPr>
         <w:pStyle w:val="NormalWeb"/>
-        <w:divId w:val="1719090648"/>
+        <w:divId w:val="1795752509"/>
         <w:rPr>
           <w:rFonts w:ascii="Segoe UI" w:hAnsi="Segoe UI" w:cs="Segoe UI"/>
           <w:color w:val="1A1A1A"/>
@@ -4003,24 +4002,24 @@
     <w:p>
       <w:pPr>
         <w:spacing w:before="360" w:after="360"/>
-        <w:divId w:val="1719090648"/>
-        <w:rPr>
-          <w:rFonts w:ascii="Segoe UI" w:eastAsia="Times New Roman" w:hAnsi="Segoe UI" w:cs="Segoe UI"/>
-          <w:color w:val="1A1A1A"/>
-          <w:sz w:val="23"/>
-          <w:szCs w:val="23"/>
-          <w:lang w:val="es-ES"/>
-        </w:rPr>
-      </w:pPr>
-      <w:r>
-        <w:rPr>
-          <w:rFonts w:ascii="Segoe UI" w:eastAsia="Times New Roman" w:hAnsi="Segoe UI" w:cs="Segoe UI"/>
-          <w:color w:val="1A1A1A"/>
-          <w:sz w:val="23"/>
-          <w:szCs w:val="23"/>
-          <w:lang w:val="es-ES"/>
-        </w:rPr>
-        <w:pict w14:anchorId="41CABD2D">
+        <w:divId w:val="1795752509"/>
+        <w:rPr>
+          <w:rFonts w:ascii="Segoe UI" w:eastAsia="Times New Roman" w:hAnsi="Segoe UI" w:cs="Segoe UI"/>
+          <w:color w:val="1A1A1A"/>
+          <w:sz w:val="23"/>
+          <w:szCs w:val="23"/>
+          <w:lang w:val="es-ES"/>
+        </w:rPr>
+      </w:pPr>
+      <w:r>
+        <w:rPr>
+          <w:rFonts w:ascii="Segoe UI" w:eastAsia="Times New Roman" w:hAnsi="Segoe UI" w:cs="Segoe UI"/>
+          <w:color w:val="1A1A1A"/>
+          <w:sz w:val="23"/>
+          <w:szCs w:val="23"/>
+          <w:lang w:val="es-ES"/>
+        </w:rPr>
+        <w:pict w14:anchorId="5AD56B04">
           <v:rect id="_x0000_i1029" style="width:0;height:1.5pt" o:hralign="center" o:hrstd="t" o:hr="t" fillcolor="#a0a0a0" stroked="f"/>
         </w:pict>
       </w:r>
@@ -4028,7 +4027,7 @@
     <w:p>
       <w:pPr>
         <w:pStyle w:val="Ttulo2"/>
-        <w:divId w:val="1719090648"/>
+        <w:divId w:val="1795752509"/>
         <w:rPr>
           <w:rFonts w:ascii="Segoe UI" w:eastAsia="Times New Roman" w:hAnsi="Segoe UI" w:cs="Segoe UI"/>
           <w:lang w:val="es-ES"/>
@@ -4045,7 +4044,7 @@
     <w:p>
       <w:pPr>
         <w:pStyle w:val="NormalWeb"/>
-        <w:divId w:val="1719090648"/>
+        <w:divId w:val="1795752509"/>
         <w:rPr>
           <w:rFonts w:ascii="Segoe UI" w:hAnsi="Segoe UI" w:cs="Segoe UI"/>
           <w:color w:val="1A1A1A"/>
@@ -4069,7 +4068,7 @@
     <w:p>
       <w:pPr>
         <w:pStyle w:val="NormalWeb"/>
-        <w:divId w:val="1719090648"/>
+        <w:divId w:val="1795752509"/>
         <w:rPr>
           <w:rFonts w:ascii="Segoe UI" w:hAnsi="Segoe UI" w:cs="Segoe UI"/>
           <w:color w:val="1A1A1A"/>
@@ -4092,7 +4091,7 @@
     <w:p>
       <w:pPr>
         <w:pStyle w:val="NormalWeb"/>
-        <w:divId w:val="1719090648"/>
+        <w:divId w:val="1795752509"/>
         <w:rPr>
           <w:rFonts w:ascii="Segoe UI" w:hAnsi="Segoe UI" w:cs="Segoe UI"/>
           <w:color w:val="1A1A1A"/>
@@ -4116,7 +4115,7 @@
     <w:p>
       <w:pPr>
         <w:pStyle w:val="NormalWeb"/>
-        <w:divId w:val="1719090648"/>
+        <w:divId w:val="1795752509"/>
         <w:rPr>
           <w:rFonts w:ascii="Segoe UI" w:hAnsi="Segoe UI" w:cs="Segoe UI"/>
           <w:color w:val="1A1A1A"/>
@@ -4160,7 +4159,7 @@
     <w:p>
       <w:pPr>
         <w:pStyle w:val="NormalWeb"/>
-        <w:divId w:val="1719090648"/>
+        <w:divId w:val="1795752509"/>
         <w:rPr>
           <w:rFonts w:ascii="Segoe UI" w:hAnsi="Segoe UI" w:cs="Segoe UI"/>
           <w:color w:val="1A1A1A"/>
@@ -4184,7 +4183,7 @@
     <w:p>
       <w:pPr>
         <w:pStyle w:val="NormalWeb"/>
-        <w:divId w:val="1719090648"/>
+        <w:divId w:val="1795752509"/>
         <w:rPr>
           <w:rFonts w:ascii="Segoe UI" w:hAnsi="Segoe UI" w:cs="Segoe UI"/>
           <w:color w:val="1A1A1A"/>
@@ -4207,7 +4206,7 @@
     <w:p>
       <w:pPr>
         <w:pStyle w:val="NormalWeb"/>
-        <w:divId w:val="1719090648"/>
+        <w:divId w:val="1795752509"/>
         <w:rPr>
           <w:rFonts w:ascii="Segoe UI" w:hAnsi="Segoe UI" w:cs="Segoe UI"/>
           <w:color w:val="1A1A1A"/>
@@ -4231,7 +4230,7 @@
     <w:p>
       <w:pPr>
         <w:pStyle w:val="NormalWeb"/>
-        <w:divId w:val="1719090648"/>
+        <w:divId w:val="1795752509"/>
         <w:rPr>
           <w:rFonts w:ascii="Segoe UI" w:hAnsi="Segoe UI" w:cs="Segoe UI"/>
           <w:color w:val="1A1A1A"/>
@@ -4254,24 +4253,24 @@
     <w:p>
       <w:pPr>
         <w:spacing w:before="360" w:after="360"/>
-        <w:divId w:val="1719090648"/>
-        <w:rPr>
-          <w:rFonts w:ascii="Segoe UI" w:eastAsia="Times New Roman" w:hAnsi="Segoe UI" w:cs="Segoe UI"/>
-          <w:color w:val="1A1A1A"/>
-          <w:sz w:val="23"/>
-          <w:szCs w:val="23"/>
-          <w:lang w:val="es-ES"/>
-        </w:rPr>
-      </w:pPr>
-      <w:r>
-        <w:rPr>
-          <w:rFonts w:ascii="Segoe UI" w:eastAsia="Times New Roman" w:hAnsi="Segoe UI" w:cs="Segoe UI"/>
-          <w:color w:val="1A1A1A"/>
-          <w:sz w:val="23"/>
-          <w:szCs w:val="23"/>
-          <w:lang w:val="es-ES"/>
-        </w:rPr>
-        <w:pict w14:anchorId="19C83D25">
+        <w:divId w:val="1795752509"/>
+        <w:rPr>
+          <w:rFonts w:ascii="Segoe UI" w:eastAsia="Times New Roman" w:hAnsi="Segoe UI" w:cs="Segoe UI"/>
+          <w:color w:val="1A1A1A"/>
+          <w:sz w:val="23"/>
+          <w:szCs w:val="23"/>
+          <w:lang w:val="es-ES"/>
+        </w:rPr>
+      </w:pPr>
+      <w:r>
+        <w:rPr>
+          <w:rFonts w:ascii="Segoe UI" w:eastAsia="Times New Roman" w:hAnsi="Segoe UI" w:cs="Segoe UI"/>
+          <w:color w:val="1A1A1A"/>
+          <w:sz w:val="23"/>
+          <w:szCs w:val="23"/>
+          <w:lang w:val="es-ES"/>
+        </w:rPr>
+        <w:pict w14:anchorId="48775151">
           <v:rect id="_x0000_i1030" style="width:0;height:1.5pt" o:hralign="center" o:hrstd="t" o:hr="t" fillcolor="#a0a0a0" stroked="f"/>
         </w:pict>
       </w:r>
@@ -4279,7 +4278,7 @@
     <w:p>
       <w:pPr>
         <w:pStyle w:val="Ttulo2"/>
-        <w:divId w:val="1719090648"/>
+        <w:divId w:val="1795752509"/>
         <w:rPr>
           <w:rFonts w:ascii="Segoe UI" w:eastAsia="Times New Roman" w:hAnsi="Segoe UI" w:cs="Segoe UI"/>
           <w:lang w:val="es-ES"/>
@@ -4301,7 +4300,7 @@
         </w:numPr>
         <w:spacing w:before="45" w:after="45"/>
         <w:ind w:left="810"/>
-        <w:divId w:val="1719090648"/>
+        <w:divId w:val="1795752509"/>
         <w:rPr>
           <w:rFonts w:ascii="Segoe UI" w:eastAsia="Times New Roman" w:hAnsi="Segoe UI" w:cs="Segoe UI"/>
           <w:color w:val="1A1A1A"/>
@@ -4350,7 +4349,7 @@
         </w:numPr>
         <w:spacing w:before="45" w:after="45"/>
         <w:ind w:left="810"/>
-        <w:divId w:val="1719090648"/>
+        <w:divId w:val="1795752509"/>
         <w:rPr>
           <w:rFonts w:ascii="Segoe UI" w:eastAsia="Times New Roman" w:hAnsi="Segoe UI" w:cs="Segoe UI"/>
           <w:color w:val="1A1A1A"/>
@@ -4389,7 +4388,7 @@
         </w:numPr>
         <w:spacing w:before="45" w:after="45"/>
         <w:ind w:left="810"/>
-        <w:divId w:val="1719090648"/>
+        <w:divId w:val="1795752509"/>
         <w:rPr>
           <w:rFonts w:ascii="Segoe UI" w:eastAsia="Times New Roman" w:hAnsi="Segoe UI" w:cs="Segoe UI"/>
           <w:color w:val="1A1A1A"/>
@@ -4438,7 +4437,7 @@
         </w:numPr>
         <w:spacing w:before="45" w:after="600"/>
         <w:ind w:left="810"/>
-        <w:divId w:val="1719090648"/>
+        <w:divId w:val="1795752509"/>
         <w:rPr>
           <w:rFonts w:ascii="Segoe UI" w:eastAsia="Times New Roman" w:hAnsi="Segoe UI" w:cs="Segoe UI"/>
           <w:color w:val="1A1A1A"/>
@@ -4492,9 +4491,9 @@
 <file path=word/numbering.xml><?xml version="1.0" encoding="utf-8"?>
 <w:numbering xmlns:wpc="http://schemas.microsoft.com/office/word/2010/wordprocessingCanvas" xmlns:cx="http://schemas.microsoft.com/office/drawing/2014/chartex" xmlns:cx1="http://schemas.microsoft.com/office/drawing/2015/9/8/chartex" xmlns:cx2="http://schemas.microsoft.com/office/drawing/2015/10/21/chartex" xmlns:cx3="http://schemas.microsoft.com/office/drawing/2016/5/9/chartex" xmlns:cx4="http://schemas.microsoft.com/office/drawing/2016/5/10/chartex" xmlns:cx5="http://schemas.microsoft.com/office/drawing/2016/5/11/chartex" xmlns:cx6="http://schemas.microsoft.com/office/drawing/2016/5/12/chartex" xmlns:cx7="http://schemas.microsoft.com/office/drawing/2016/5/13/chartex" xmlns:cx8="http://schemas.microsoft.com/office/drawing/2016/5/14/chartex" xmlns:mc="http://schemas.openxmlformats.org/markup-compatibility/2006" xmlns:aink="http://schemas.microsoft.com/office/drawing/2016/ink" xmlns:am3d="http://schemas.microsoft.com/office/drawing/2017/model3d" xmlns:o="urn:schemas-microsoft-com:office:office" xmlns:oel="http://schemas.microsoft.com/office/2019/extlst" xmlns:r="http://schemas.openxmlformats.org/officeDocument/2006/relationships" xmlns:m="http://schemas.openxmlformats.org/officeDocument/2006/math" xmlns:v="urn:schemas-microsoft-com:vml" xmlns:wp14="http://schemas.microsoft.com/office/word/2010/wordprocessingDrawing" xmlns:wp="http://schemas.openxmlformats.org/drawingml/2006/wordprocessingDrawing" xmlns:w10="urn:schemas-microsoft-com:office:word" xmlns:w="http://schemas.openxmlformats.org/wordprocessingml/2006/main" xmlns:w14="http://schemas.microsoft.com/office/word/2010/wordml" xmlns:w15="http://schemas.microsoft.com/office/word/2012/wordml" xmlns:w16cex="http://schemas.microsoft.com/office/word/2018/wordml/cex" xmlns:w16cid="http://schemas.microsoft.com/office/word/2016/wordml/cid" xmlns:w16="http://schemas.microsoft.com/office/word/2018/wordml" xmlns:w16du="http://schemas.microsoft.com/office/word/2023/wordml/word16du" xmlns:w16sdtdh="http://schemas.microsoft.com/office/word/2020/wordml/sdtdatahash" xmlns:w16sdtfl="http://schemas.microsoft.com/office/word/2024/wordml/sdtformatlock" xmlns:w16se="http://schemas.microsoft.com/office/word/2015/wordml/symex" xmlns:wpg="http://schemas.microsoft.com/office/word/2010/wordprocessingGroup" xmlns:wpi="http://schemas.microsoft.com/office/word/2010/wordprocessingInk" xmlns:wne="http://schemas.microsoft.com/office/word/2006/wordml" xmlns:wps="http://schemas.microsoft.com/office/word/2010/wordprocessingShape" mc:Ignorable="w14 w15 w16se w16cid w16 w16cex w16sdtdh w16sdtfl w16du wp14">
   <w:abstractNum w:abstractNumId="0" w15:restartNumberingAfterBreak="0">
-    <w:nsid w:val="02B468DF"/>
+    <w:nsid w:val="18AD4F2D"/>
     <w:multiLevelType w:val="multilevel"/>
-    <w:tmpl w:val="236A1B2E"/>
+    <w:tmpl w:val="661A76BA"/>
     <w:lvl w:ilvl="0">
       <w:start w:val="1"/>
       <w:numFmt w:val="bullet"/>
@@ -4641,9 +4640,235 @@
     </w:lvl>
   </w:abstractNum>
   <w:abstractNum w:abstractNumId="1" w15:restartNumberingAfterBreak="0">
-    <w:nsid w:val="0BCB2010"/>
+    <w:nsid w:val="1CE231DE"/>
     <w:multiLevelType w:val="multilevel"/>
-    <w:tmpl w:val="9D00B93C"/>
+    <w:tmpl w:val="9F040068"/>
+    <w:lvl w:ilvl="0">
+      <w:start w:val="1"/>
+      <w:numFmt w:val="decimal"/>
+      <w:lvlText w:val="%1."/>
+      <w:lvlJc w:val="left"/>
+      <w:pPr>
+        <w:tabs>
+          <w:tab w:val="num" w:pos="720"/>
+        </w:tabs>
+        <w:ind w:left="720" w:hanging="360"/>
+      </w:pPr>
+    </w:lvl>
+    <w:lvl w:ilvl="1" w:tentative="1">
+      <w:start w:val="1"/>
+      <w:numFmt w:val="decimal"/>
+      <w:lvlText w:val="%2."/>
+      <w:lvlJc w:val="left"/>
+      <w:pPr>
+        <w:tabs>
+          <w:tab w:val="num" w:pos="1440"/>
+        </w:tabs>
+        <w:ind w:left="1440" w:hanging="360"/>
+      </w:pPr>
+    </w:lvl>
+    <w:lvl w:ilvl="2" w:tentative="1">
+      <w:start w:val="1"/>
+      <w:numFmt w:val="decimal"/>
+      <w:lvlText w:val="%3."/>
+      <w:lvlJc w:val="left"/>
+      <w:pPr>
+        <w:tabs>
+          <w:tab w:val="num" w:pos="2160"/>
+        </w:tabs>
+        <w:ind w:left="2160" w:hanging="360"/>
+      </w:pPr>
+    </w:lvl>
+    <w:lvl w:ilvl="3" w:tentative="1">
+      <w:start w:val="1"/>
+      <w:numFmt w:val="decimal"/>
+      <w:lvlText w:val="%4."/>
+      <w:lvlJc w:val="left"/>
+      <w:pPr>
+        <w:tabs>
+          <w:tab w:val="num" w:pos="2880"/>
+        </w:tabs>
+        <w:ind w:left="2880" w:hanging="360"/>
+      </w:pPr>
+    </w:lvl>
+    <w:lvl w:ilvl="4" w:tentative="1">
+      <w:start w:val="1"/>
+      <w:numFmt w:val="decimal"/>
+      <w:lvlText w:val="%5."/>
+      <w:lvlJc w:val="left"/>
+      <w:pPr>
+        <w:tabs>
+          <w:tab w:val="num" w:pos="3600"/>
+        </w:tabs>
+        <w:ind w:left="3600" w:hanging="360"/>
+      </w:pPr>
+    </w:lvl>
+    <w:lvl w:ilvl="5" w:tentative="1">
+      <w:start w:val="1"/>
+      <w:numFmt w:val="decimal"/>
+      <w:lvlText w:val="%6."/>
+      <w:lvlJc w:val="left"/>
+      <w:pPr>
+        <w:tabs>
+          <w:tab w:val="num" w:pos="4320"/>
+        </w:tabs>
+        <w:ind w:left="4320" w:hanging="360"/>
+      </w:pPr>
+    </w:lvl>
+    <w:lvl w:ilvl="6" w:tentative="1">
+      <w:start w:val="1"/>
+      <w:numFmt w:val="decimal"/>
+      <w:lvlText w:val="%7."/>
+      <w:lvlJc w:val="left"/>
+      <w:pPr>
+        <w:tabs>
+          <w:tab w:val="num" w:pos="5040"/>
+        </w:tabs>
+        <w:ind w:left="5040" w:hanging="360"/>
+      </w:pPr>
+    </w:lvl>
+    <w:lvl w:ilvl="7" w:tentative="1">
+      <w:start w:val="1"/>
+      <w:numFmt w:val="decimal"/>
+      <w:lvlText w:val="%8."/>
+      <w:lvlJc w:val="left"/>
+      <w:pPr>
+        <w:tabs>
+          <w:tab w:val="num" w:pos="5760"/>
+        </w:tabs>
+        <w:ind w:left="5760" w:hanging="360"/>
+      </w:pPr>
+    </w:lvl>
+    <w:lvl w:ilvl="8" w:tentative="1">
+      <w:start w:val="1"/>
+      <w:numFmt w:val="decimal"/>
+      <w:lvlText w:val="%9."/>
+      <w:lvlJc w:val="left"/>
+      <w:pPr>
+        <w:tabs>
+          <w:tab w:val="num" w:pos="6480"/>
+        </w:tabs>
+        <w:ind w:left="6480" w:hanging="360"/>
+      </w:pPr>
+    </w:lvl>
+  </w:abstractNum>
+  <w:abstractNum w:abstractNumId="2" w15:restartNumberingAfterBreak="0">
+    <w:nsid w:val="1D8065F3"/>
+    <w:multiLevelType w:val="multilevel"/>
+    <w:tmpl w:val="C23C2C16"/>
+    <w:lvl w:ilvl="0">
+      <w:start w:val="1"/>
+      <w:numFmt w:val="decimal"/>
+      <w:lvlText w:val="%1."/>
+      <w:lvlJc w:val="left"/>
+      <w:pPr>
+        <w:tabs>
+          <w:tab w:val="num" w:pos="720"/>
+        </w:tabs>
+        <w:ind w:left="720" w:hanging="360"/>
+      </w:pPr>
+    </w:lvl>
+    <w:lvl w:ilvl="1" w:tentative="1">
+      <w:start w:val="1"/>
+      <w:numFmt w:val="decimal"/>
+      <w:lvlText w:val="%2."/>
+      <w:lvlJc w:val="left"/>
+      <w:pPr>
+        <w:tabs>
+          <w:tab w:val="num" w:pos="1440"/>
+        </w:tabs>
+        <w:ind w:left="1440" w:hanging="360"/>
+      </w:pPr>
+    </w:lvl>
+    <w:lvl w:ilvl="2" w:tentative="1">
+      <w:start w:val="1"/>
+      <w:numFmt w:val="decimal"/>
+      <w:lvlText w:val="%3."/>
+      <w:lvlJc w:val="left"/>
+      <w:pPr>
+        <w:tabs>
+          <w:tab w:val="num" w:pos="2160"/>
+        </w:tabs>
+        <w:ind w:left="2160" w:hanging="360"/>
+      </w:pPr>
+    </w:lvl>
+    <w:lvl w:ilvl="3" w:tentative="1">
+      <w:start w:val="1"/>
+      <w:numFmt w:val="decimal"/>
+      <w:lvlText w:val="%4."/>
+      <w:lvlJc w:val="left"/>
+      <w:pPr>
+        <w:tabs>
+          <w:tab w:val="num" w:pos="2880"/>
+        </w:tabs>
+        <w:ind w:left="2880" w:hanging="360"/>
+      </w:pPr>
+    </w:lvl>
+    <w:lvl w:ilvl="4" w:tentative="1">
+      <w:start w:val="1"/>
+      <w:numFmt w:val="decimal"/>
+      <w:lvlText w:val="%5."/>
+      <w:lvlJc w:val="left"/>
+      <w:pPr>
+        <w:tabs>
+          <w:tab w:val="num" w:pos="3600"/>
+        </w:tabs>
+        <w:ind w:left="3600" w:hanging="360"/>
+      </w:pPr>
+    </w:lvl>
+    <w:lvl w:ilvl="5" w:tentative="1">
+      <w:start w:val="1"/>
+      <w:numFmt w:val="decimal"/>
+      <w:lvlText w:val="%6."/>
+      <w:lvlJc w:val="left"/>
+      <w:pPr>
+        <w:tabs>
+          <w:tab w:val="num" w:pos="4320"/>
+        </w:tabs>
+        <w:ind w:left="4320" w:hanging="360"/>
+      </w:pPr>
+    </w:lvl>
+    <w:lvl w:ilvl="6" w:tentative="1">
+      <w:start w:val="1"/>
+      <w:numFmt w:val="decimal"/>
+      <w:lvlText w:val="%7."/>
+      <w:lvlJc w:val="left"/>
+      <w:pPr>
+        <w:tabs>
+          <w:tab w:val="num" w:pos="5040"/>
+        </w:tabs>
+        <w:ind w:left="5040" w:hanging="360"/>
+      </w:pPr>
+    </w:lvl>
+    <w:lvl w:ilvl="7" w:tentative="1">
+      <w:start w:val="1"/>
+      <w:numFmt w:val="decimal"/>
+      <w:lvlText w:val="%8."/>
+      <w:lvlJc w:val="left"/>
+      <w:pPr>
+        <w:tabs>
+          <w:tab w:val="num" w:pos="5760"/>
+        </w:tabs>
+        <w:ind w:left="5760" w:hanging="360"/>
+      </w:pPr>
+    </w:lvl>
+    <w:lvl w:ilvl="8" w:tentative="1">
+      <w:start w:val="1"/>
+      <w:numFmt w:val="decimal"/>
+      <w:lvlText w:val="%9."/>
+      <w:lvlJc w:val="left"/>
+      <w:pPr>
+        <w:tabs>
+          <w:tab w:val="num" w:pos="6480"/>
+        </w:tabs>
+        <w:ind w:left="6480" w:hanging="360"/>
+      </w:pPr>
+    </w:lvl>
+  </w:abstractNum>
+  <w:abstractNum w:abstractNumId="3" w15:restartNumberingAfterBreak="0">
+    <w:nsid w:val="1FA23DCA"/>
+    <w:multiLevelType w:val="multilevel"/>
+    <w:tmpl w:val="39EEEF28"/>
     <w:lvl w:ilvl="0">
       <w:start w:val="1"/>
       <w:numFmt w:val="bullet"/>
@@ -4789,349 +5014,10 @@
       </w:rPr>
     </w:lvl>
   </w:abstractNum>
-  <w:abstractNum w:abstractNumId="2" w15:restartNumberingAfterBreak="0">
-    <w:nsid w:val="192013C2"/>
+  <w:abstractNum w:abstractNumId="4" w15:restartNumberingAfterBreak="0">
+    <w:nsid w:val="2CCF48B7"/>
     <w:multiLevelType w:val="multilevel"/>
-    <w:tmpl w:val="605AB7D4"/>
-    <w:lvl w:ilvl="0">
-      <w:start w:val="1"/>
-      <w:numFmt w:val="decimal"/>
-      <w:lvlText w:val="%1."/>
-      <w:lvlJc w:val="left"/>
-      <w:pPr>
-        <w:tabs>
-          <w:tab w:val="num" w:pos="720"/>
-        </w:tabs>
-        <w:ind w:left="720" w:hanging="360"/>
-      </w:pPr>
-    </w:lvl>
-    <w:lvl w:ilvl="1" w:tentative="1">
-      <w:start w:val="1"/>
-      <w:numFmt w:val="decimal"/>
-      <w:lvlText w:val="%2."/>
-      <w:lvlJc w:val="left"/>
-      <w:pPr>
-        <w:tabs>
-          <w:tab w:val="num" w:pos="1440"/>
-        </w:tabs>
-        <w:ind w:left="1440" w:hanging="360"/>
-      </w:pPr>
-    </w:lvl>
-    <w:lvl w:ilvl="2" w:tentative="1">
-      <w:start w:val="1"/>
-      <w:numFmt w:val="decimal"/>
-      <w:lvlText w:val="%3."/>
-      <w:lvlJc w:val="left"/>
-      <w:pPr>
-        <w:tabs>
-          <w:tab w:val="num" w:pos="2160"/>
-        </w:tabs>
-        <w:ind w:left="2160" w:hanging="360"/>
-      </w:pPr>
-    </w:lvl>
-    <w:lvl w:ilvl="3" w:tentative="1">
-      <w:start w:val="1"/>
-      <w:numFmt w:val="decimal"/>
-      <w:lvlText w:val="%4."/>
-      <w:lvlJc w:val="left"/>
-      <w:pPr>
-        <w:tabs>
-          <w:tab w:val="num" w:pos="2880"/>
-        </w:tabs>
-        <w:ind w:left="2880" w:hanging="360"/>
-      </w:pPr>
-    </w:lvl>
-    <w:lvl w:ilvl="4" w:tentative="1">
-      <w:start w:val="1"/>
-      <w:numFmt w:val="decimal"/>
-      <w:lvlText w:val="%5."/>
-      <w:lvlJc w:val="left"/>
-      <w:pPr>
-        <w:tabs>
-          <w:tab w:val="num" w:pos="3600"/>
-        </w:tabs>
-        <w:ind w:left="3600" w:hanging="360"/>
-      </w:pPr>
-    </w:lvl>
-    <w:lvl w:ilvl="5" w:tentative="1">
-      <w:start w:val="1"/>
-      <w:numFmt w:val="decimal"/>
-      <w:lvlText w:val="%6."/>
-      <w:lvlJc w:val="left"/>
-      <w:pPr>
-        <w:tabs>
-          <w:tab w:val="num" w:pos="4320"/>
-        </w:tabs>
-        <w:ind w:left="4320" w:hanging="360"/>
-      </w:pPr>
-    </w:lvl>
-    <w:lvl w:ilvl="6" w:tentative="1">
-      <w:start w:val="1"/>
-      <w:numFmt w:val="decimal"/>
-      <w:lvlText w:val="%7."/>
-      <w:lvlJc w:val="left"/>
-      <w:pPr>
-        <w:tabs>
-          <w:tab w:val="num" w:pos="5040"/>
-        </w:tabs>
-        <w:ind w:left="5040" w:hanging="360"/>
-      </w:pPr>
-    </w:lvl>
-    <w:lvl w:ilvl="7" w:tentative="1">
-      <w:start w:val="1"/>
-      <w:numFmt w:val="decimal"/>
-      <w:lvlText w:val="%8."/>
-      <w:lvlJc w:val="left"/>
-      <w:pPr>
-        <w:tabs>
-          <w:tab w:val="num" w:pos="5760"/>
-        </w:tabs>
-        <w:ind w:left="5760" w:hanging="360"/>
-      </w:pPr>
-    </w:lvl>
-    <w:lvl w:ilvl="8" w:tentative="1">
-      <w:start w:val="1"/>
-      <w:numFmt w:val="decimal"/>
-      <w:lvlText w:val="%9."/>
-      <w:lvlJc w:val="left"/>
-      <w:pPr>
-        <w:tabs>
-          <w:tab w:val="num" w:pos="6480"/>
-        </w:tabs>
-        <w:ind w:left="6480" w:hanging="360"/>
-      </w:pPr>
-    </w:lvl>
-  </w:abstractNum>
-  <w:abstractNum w:abstractNumId="3" w15:restartNumberingAfterBreak="0">
-    <w:nsid w:val="196F7261"/>
-    <w:multiLevelType w:val="multilevel"/>
-    <w:tmpl w:val="8EFE0D4C"/>
-    <w:lvl w:ilvl="0">
-      <w:start w:val="1"/>
-      <w:numFmt w:val="decimal"/>
-      <w:lvlText w:val="%1."/>
-      <w:lvlJc w:val="left"/>
-      <w:pPr>
-        <w:tabs>
-          <w:tab w:val="num" w:pos="720"/>
-        </w:tabs>
-        <w:ind w:left="720" w:hanging="360"/>
-      </w:pPr>
-    </w:lvl>
-    <w:lvl w:ilvl="1" w:tentative="1">
-      <w:start w:val="1"/>
-      <w:numFmt w:val="decimal"/>
-      <w:lvlText w:val="%2."/>
-      <w:lvlJc w:val="left"/>
-      <w:pPr>
-        <w:tabs>
-          <w:tab w:val="num" w:pos="1440"/>
-        </w:tabs>
-        <w:ind w:left="1440" w:hanging="360"/>
-      </w:pPr>
-    </w:lvl>
-    <w:lvl w:ilvl="2" w:tentative="1">
-      <w:start w:val="1"/>
-      <w:numFmt w:val="decimal"/>
-      <w:lvlText w:val="%3."/>
-      <w:lvlJc w:val="left"/>
-      <w:pPr>
-        <w:tabs>
-          <w:tab w:val="num" w:pos="2160"/>
-        </w:tabs>
-        <w:ind w:left="2160" w:hanging="360"/>
-      </w:pPr>
-    </w:lvl>
-    <w:lvl w:ilvl="3" w:tentative="1">
-      <w:start w:val="1"/>
-      <w:numFmt w:val="decimal"/>
-      <w:lvlText w:val="%4."/>
-      <w:lvlJc w:val="left"/>
-      <w:pPr>
-        <w:tabs>
-          <w:tab w:val="num" w:pos="2880"/>
-        </w:tabs>
-        <w:ind w:left="2880" w:hanging="360"/>
-      </w:pPr>
-    </w:lvl>
-    <w:lvl w:ilvl="4" w:tentative="1">
-      <w:start w:val="1"/>
-      <w:numFmt w:val="decimal"/>
-      <w:lvlText w:val="%5."/>
-      <w:lvlJc w:val="left"/>
-      <w:pPr>
-        <w:tabs>
-          <w:tab w:val="num" w:pos="3600"/>
-        </w:tabs>
-        <w:ind w:left="3600" w:hanging="360"/>
-      </w:pPr>
-    </w:lvl>
-    <w:lvl w:ilvl="5" w:tentative="1">
-      <w:start w:val="1"/>
-      <w:numFmt w:val="decimal"/>
-      <w:lvlText w:val="%6."/>
-      <w:lvlJc w:val="left"/>
-      <w:pPr>
-        <w:tabs>
-          <w:tab w:val="num" w:pos="4320"/>
-        </w:tabs>
-        <w:ind w:left="4320" w:hanging="360"/>
-      </w:pPr>
-    </w:lvl>
-    <w:lvl w:ilvl="6" w:tentative="1">
-      <w:start w:val="1"/>
-      <w:numFmt w:val="decimal"/>
-      <w:lvlText w:val="%7."/>
-      <w:lvlJc w:val="left"/>
-      <w:pPr>
-        <w:tabs>
-          <w:tab w:val="num" w:pos="5040"/>
-        </w:tabs>
-        <w:ind w:left="5040" w:hanging="360"/>
-      </w:pPr>
-    </w:lvl>
-    <w:lvl w:ilvl="7" w:tentative="1">
-      <w:start w:val="1"/>
-      <w:numFmt w:val="decimal"/>
-      <w:lvlText w:val="%8."/>
-      <w:lvlJc w:val="left"/>
-      <w:pPr>
-        <w:tabs>
-          <w:tab w:val="num" w:pos="5760"/>
-        </w:tabs>
-        <w:ind w:left="5760" w:hanging="360"/>
-      </w:pPr>
-    </w:lvl>
-    <w:lvl w:ilvl="8" w:tentative="1">
-      <w:start w:val="1"/>
-      <w:numFmt w:val="decimal"/>
-      <w:lvlText w:val="%9."/>
-      <w:lvlJc w:val="left"/>
-      <w:pPr>
-        <w:tabs>
-          <w:tab w:val="num" w:pos="6480"/>
-        </w:tabs>
-        <w:ind w:left="6480" w:hanging="360"/>
-      </w:pPr>
-    </w:lvl>
-  </w:abstractNum>
-  <w:abstractNum w:abstractNumId="4" w15:restartNumberingAfterBreak="0">
-    <w:nsid w:val="1FAC3F92"/>
-    <w:multiLevelType w:val="multilevel"/>
-    <w:tmpl w:val="FF668E1A"/>
-    <w:lvl w:ilvl="0">
-      <w:start w:val="1"/>
-      <w:numFmt w:val="decimal"/>
-      <w:lvlText w:val="%1."/>
-      <w:lvlJc w:val="left"/>
-      <w:pPr>
-        <w:tabs>
-          <w:tab w:val="num" w:pos="720"/>
-        </w:tabs>
-        <w:ind w:left="720" w:hanging="360"/>
-      </w:pPr>
-    </w:lvl>
-    <w:lvl w:ilvl="1" w:tentative="1">
-      <w:start w:val="1"/>
-      <w:numFmt w:val="decimal"/>
-      <w:lvlText w:val="%2."/>
-      <w:lvlJc w:val="left"/>
-      <w:pPr>
-        <w:tabs>
-          <w:tab w:val="num" w:pos="1440"/>
-        </w:tabs>
-        <w:ind w:left="1440" w:hanging="360"/>
-      </w:pPr>
-    </w:lvl>
-    <w:lvl w:ilvl="2" w:tentative="1">
-      <w:start w:val="1"/>
-      <w:numFmt w:val="decimal"/>
-      <w:lvlText w:val="%3."/>
-      <w:lvlJc w:val="left"/>
-      <w:pPr>
-        <w:tabs>
-          <w:tab w:val="num" w:pos="2160"/>
-        </w:tabs>
-        <w:ind w:left="2160" w:hanging="360"/>
-      </w:pPr>
-    </w:lvl>
-    <w:lvl w:ilvl="3" w:tentative="1">
-      <w:start w:val="1"/>
-      <w:numFmt w:val="decimal"/>
-      <w:lvlText w:val="%4."/>
-      <w:lvlJc w:val="left"/>
-      <w:pPr>
-        <w:tabs>
-          <w:tab w:val="num" w:pos="2880"/>
-        </w:tabs>
-        <w:ind w:left="2880" w:hanging="360"/>
-      </w:pPr>
-    </w:lvl>
-    <w:lvl w:ilvl="4" w:tentative="1">
-      <w:start w:val="1"/>
-      <w:numFmt w:val="decimal"/>
-      <w:lvlText w:val="%5."/>
-      <w:lvlJc w:val="left"/>
-      <w:pPr>
-        <w:tabs>
-          <w:tab w:val="num" w:pos="3600"/>
-        </w:tabs>
-        <w:ind w:left="3600" w:hanging="360"/>
-      </w:pPr>
-    </w:lvl>
-    <w:lvl w:ilvl="5" w:tentative="1">
-      <w:start w:val="1"/>
-      <w:numFmt w:val="decimal"/>
-      <w:lvlText w:val="%6."/>
-      <w:lvlJc w:val="left"/>
-      <w:pPr>
-        <w:tabs>
-          <w:tab w:val="num" w:pos="4320"/>
-        </w:tabs>
-        <w:ind w:left="4320" w:hanging="360"/>
-      </w:pPr>
-    </w:lvl>
-    <w:lvl w:ilvl="6" w:tentative="1">
-      <w:start w:val="1"/>
-      <w:numFmt w:val="decimal"/>
-      <w:lvlText w:val="%7."/>
-      <w:lvlJc w:val="left"/>
-      <w:pPr>
-        <w:tabs>
-          <w:tab w:val="num" w:pos="5040"/>
-        </w:tabs>
-        <w:ind w:left="5040" w:hanging="360"/>
-      </w:pPr>
-    </w:lvl>
-    <w:lvl w:ilvl="7" w:tentative="1">
-      <w:start w:val="1"/>
-      <w:numFmt w:val="decimal"/>
-      <w:lvlText w:val="%8."/>
-      <w:lvlJc w:val="left"/>
-      <w:pPr>
-        <w:tabs>
-          <w:tab w:val="num" w:pos="5760"/>
-        </w:tabs>
-        <w:ind w:left="5760" w:hanging="360"/>
-      </w:pPr>
-    </w:lvl>
-    <w:lvl w:ilvl="8" w:tentative="1">
-      <w:start w:val="1"/>
-      <w:numFmt w:val="decimal"/>
-      <w:lvlText w:val="%9."/>
-      <w:lvlJc w:val="left"/>
-      <w:pPr>
-        <w:tabs>
-          <w:tab w:val="num" w:pos="6480"/>
-        </w:tabs>
-        <w:ind w:left="6480" w:hanging="360"/>
-      </w:pPr>
-    </w:lvl>
-  </w:abstractNum>
-  <w:abstractNum w:abstractNumId="5" w15:restartNumberingAfterBreak="0">
-    <w:nsid w:val="30E21314"/>
-    <w:multiLevelType w:val="multilevel"/>
-    <w:tmpl w:val="4B1E53DA"/>
+    <w:tmpl w:val="C20AA34E"/>
     <w:lvl w:ilvl="0">
       <w:start w:val="1"/>
       <w:numFmt w:val="bullet"/>
@@ -5277,10 +5163,10 @@
       </w:rPr>
     </w:lvl>
   </w:abstractNum>
-  <w:abstractNum w:abstractNumId="6" w15:restartNumberingAfterBreak="0">
-    <w:nsid w:val="35123C64"/>
+  <w:abstractNum w:abstractNumId="5" w15:restartNumberingAfterBreak="0">
+    <w:nsid w:val="2EF40362"/>
     <w:multiLevelType w:val="multilevel"/>
-    <w:tmpl w:val="16A6292A"/>
+    <w:tmpl w:val="0C764B22"/>
     <w:lvl w:ilvl="0">
       <w:start w:val="1"/>
       <w:numFmt w:val="bullet"/>
@@ -5426,123 +5312,123 @@
       </w:rPr>
     </w:lvl>
   </w:abstractNum>
+  <w:abstractNum w:abstractNumId="6" w15:restartNumberingAfterBreak="0">
+    <w:nsid w:val="31DA4820"/>
+    <w:multiLevelType w:val="multilevel"/>
+    <w:tmpl w:val="842883DA"/>
+    <w:lvl w:ilvl="0">
+      <w:start w:val="1"/>
+      <w:numFmt w:val="decimal"/>
+      <w:lvlText w:val="%1."/>
+      <w:lvlJc w:val="left"/>
+      <w:pPr>
+        <w:tabs>
+          <w:tab w:val="num" w:pos="720"/>
+        </w:tabs>
+        <w:ind w:left="720" w:hanging="360"/>
+      </w:pPr>
+    </w:lvl>
+    <w:lvl w:ilvl="1" w:tentative="1">
+      <w:start w:val="1"/>
+      <w:numFmt w:val="decimal"/>
+      <w:lvlText w:val="%2."/>
+      <w:lvlJc w:val="left"/>
+      <w:pPr>
+        <w:tabs>
+          <w:tab w:val="num" w:pos="1440"/>
+        </w:tabs>
+        <w:ind w:left="1440" w:hanging="360"/>
+      </w:pPr>
+    </w:lvl>
+    <w:lvl w:ilvl="2" w:tentative="1">
+      <w:start w:val="1"/>
+      <w:numFmt w:val="decimal"/>
+      <w:lvlText w:val="%3."/>
+      <w:lvlJc w:val="left"/>
+      <w:pPr>
+        <w:tabs>
+          <w:tab w:val="num" w:pos="2160"/>
+        </w:tabs>
+        <w:ind w:left="2160" w:hanging="360"/>
+      </w:pPr>
+    </w:lvl>
+    <w:lvl w:ilvl="3" w:tentative="1">
+      <w:start w:val="1"/>
+      <w:numFmt w:val="decimal"/>
+      <w:lvlText w:val="%4."/>
+      <w:lvlJc w:val="left"/>
+      <w:pPr>
+        <w:tabs>
+          <w:tab w:val="num" w:pos="2880"/>
+        </w:tabs>
+        <w:ind w:left="2880" w:hanging="360"/>
+      </w:pPr>
+    </w:lvl>
+    <w:lvl w:ilvl="4" w:tentative="1">
+      <w:start w:val="1"/>
+      <w:numFmt w:val="decimal"/>
+      <w:lvlText w:val="%5."/>
+      <w:lvlJc w:val="left"/>
+      <w:pPr>
+        <w:tabs>
+          <w:tab w:val="num" w:pos="3600"/>
+        </w:tabs>
+        <w:ind w:left="3600" w:hanging="360"/>
+      </w:pPr>
+    </w:lvl>
+    <w:lvl w:ilvl="5" w:tentative="1">
+      <w:start w:val="1"/>
+      <w:numFmt w:val="decimal"/>
+      <w:lvlText w:val="%6."/>
+      <w:lvlJc w:val="left"/>
+      <w:pPr>
+        <w:tabs>
+          <w:tab w:val="num" w:pos="4320"/>
+        </w:tabs>
+        <w:ind w:left="4320" w:hanging="360"/>
+      </w:pPr>
+    </w:lvl>
+    <w:lvl w:ilvl="6" w:tentative="1">
+      <w:start w:val="1"/>
+      <w:numFmt w:val="decimal"/>
+      <w:lvlText w:val="%7."/>
+      <w:lvlJc w:val="left"/>
+      <w:pPr>
+        <w:tabs>
+          <w:tab w:val="num" w:pos="5040"/>
+        </w:tabs>
+        <w:ind w:left="5040" w:hanging="360"/>
+      </w:pPr>
+    </w:lvl>
+    <w:lvl w:ilvl="7" w:tentative="1">
+      <w:start w:val="1"/>
+      <w:numFmt w:val="decimal"/>
+      <w:lvlText w:val="%8."/>
+      <w:lvlJc w:val="left"/>
+      <w:pPr>
+        <w:tabs>
+          <w:tab w:val="num" w:pos="5760"/>
+        </w:tabs>
+        <w:ind w:left="5760" w:hanging="360"/>
+      </w:pPr>
+    </w:lvl>
+    <w:lvl w:ilvl="8" w:tentative="1">
+      <w:start w:val="1"/>
+      <w:numFmt w:val="decimal"/>
+      <w:lvlText w:val="%9."/>
+      <w:lvlJc w:val="left"/>
+      <w:pPr>
+        <w:tabs>
+          <w:tab w:val="num" w:pos="6480"/>
+        </w:tabs>
+        <w:ind w:left="6480" w:hanging="360"/>
+      </w:pPr>
+    </w:lvl>
+  </w:abstractNum>
   <w:abstractNum w:abstractNumId="7" w15:restartNumberingAfterBreak="0">
-    <w:nsid w:val="3A145C15"/>
+    <w:nsid w:val="352B6A33"/>
     <w:multiLevelType w:val="multilevel"/>
-    <w:tmpl w:val="BADABC18"/>
-    <w:lvl w:ilvl="0">
-      <w:start w:val="1"/>
-      <w:numFmt w:val="decimal"/>
-      <w:lvlText w:val="%1."/>
-      <w:lvlJc w:val="left"/>
-      <w:pPr>
-        <w:tabs>
-          <w:tab w:val="num" w:pos="720"/>
-        </w:tabs>
-        <w:ind w:left="720" w:hanging="360"/>
-      </w:pPr>
-    </w:lvl>
-    <w:lvl w:ilvl="1" w:tentative="1">
-      <w:start w:val="1"/>
-      <w:numFmt w:val="decimal"/>
-      <w:lvlText w:val="%2."/>
-      <w:lvlJc w:val="left"/>
-      <w:pPr>
-        <w:tabs>
-          <w:tab w:val="num" w:pos="1440"/>
-        </w:tabs>
-        <w:ind w:left="1440" w:hanging="360"/>
-      </w:pPr>
-    </w:lvl>
-    <w:lvl w:ilvl="2" w:tentative="1">
-      <w:start w:val="1"/>
-      <w:numFmt w:val="decimal"/>
-      <w:lvlText w:val="%3."/>
-      <w:lvlJc w:val="left"/>
-      <w:pPr>
-        <w:tabs>
-          <w:tab w:val="num" w:pos="2160"/>
-        </w:tabs>
-        <w:ind w:left="2160" w:hanging="360"/>
-      </w:pPr>
-    </w:lvl>
-    <w:lvl w:ilvl="3" w:tentative="1">
-      <w:start w:val="1"/>
-      <w:numFmt w:val="decimal"/>
-      <w:lvlText w:val="%4."/>
-      <w:lvlJc w:val="left"/>
-      <w:pPr>
-        <w:tabs>
-          <w:tab w:val="num" w:pos="2880"/>
-        </w:tabs>
-        <w:ind w:left="2880" w:hanging="360"/>
-      </w:pPr>
-    </w:lvl>
-    <w:lvl w:ilvl="4" w:tentative="1">
-      <w:start w:val="1"/>
-      <w:numFmt w:val="decimal"/>
-      <w:lvlText w:val="%5."/>
-      <w:lvlJc w:val="left"/>
-      <w:pPr>
-        <w:tabs>
-          <w:tab w:val="num" w:pos="3600"/>
-        </w:tabs>
-        <w:ind w:left="3600" w:hanging="360"/>
-      </w:pPr>
-    </w:lvl>
-    <w:lvl w:ilvl="5" w:tentative="1">
-      <w:start w:val="1"/>
-      <w:numFmt w:val="decimal"/>
-      <w:lvlText w:val="%6."/>
-      <w:lvlJc w:val="left"/>
-      <w:pPr>
-        <w:tabs>
-          <w:tab w:val="num" w:pos="4320"/>
-        </w:tabs>
-        <w:ind w:left="4320" w:hanging="360"/>
-      </w:pPr>
-    </w:lvl>
-    <w:lvl w:ilvl="6" w:tentative="1">
-      <w:start w:val="1"/>
-      <w:numFmt w:val="decimal"/>
-      <w:lvlText w:val="%7."/>
-      <w:lvlJc w:val="left"/>
-      <w:pPr>
-        <w:tabs>
-          <w:tab w:val="num" w:pos="5040"/>
-        </w:tabs>
-        <w:ind w:left="5040" w:hanging="360"/>
-      </w:pPr>
-    </w:lvl>
-    <w:lvl w:ilvl="7" w:tentative="1">
-      <w:start w:val="1"/>
-      <w:numFmt w:val="decimal"/>
-      <w:lvlText w:val="%8."/>
-      <w:lvlJc w:val="left"/>
-      <w:pPr>
-        <w:tabs>
-          <w:tab w:val="num" w:pos="5760"/>
-        </w:tabs>
-        <w:ind w:left="5760" w:hanging="360"/>
-      </w:pPr>
-    </w:lvl>
-    <w:lvl w:ilvl="8" w:tentative="1">
-      <w:start w:val="1"/>
-      <w:numFmt w:val="decimal"/>
-      <w:lvlText w:val="%9."/>
-      <w:lvlJc w:val="left"/>
-      <w:pPr>
-        <w:tabs>
-          <w:tab w:val="num" w:pos="6480"/>
-        </w:tabs>
-        <w:ind w:left="6480" w:hanging="360"/>
-      </w:pPr>
-    </w:lvl>
-  </w:abstractNum>
-  <w:abstractNum w:abstractNumId="8" w15:restartNumberingAfterBreak="0">
-    <w:nsid w:val="40F773E1"/>
-    <w:multiLevelType w:val="multilevel"/>
-    <w:tmpl w:val="B11CFD3E"/>
+    <w:tmpl w:val="DE1084F6"/>
     <w:lvl w:ilvl="0">
       <w:start w:val="1"/>
       <w:numFmt w:val="bullet"/>
@@ -5688,10 +5574,123 @@
       </w:rPr>
     </w:lvl>
   </w:abstractNum>
+  <w:abstractNum w:abstractNumId="8" w15:restartNumberingAfterBreak="0">
+    <w:nsid w:val="3826551E"/>
+    <w:multiLevelType w:val="multilevel"/>
+    <w:tmpl w:val="5DC48CA6"/>
+    <w:lvl w:ilvl="0">
+      <w:start w:val="1"/>
+      <w:numFmt w:val="decimal"/>
+      <w:lvlText w:val="%1."/>
+      <w:lvlJc w:val="left"/>
+      <w:pPr>
+        <w:tabs>
+          <w:tab w:val="num" w:pos="720"/>
+        </w:tabs>
+        <w:ind w:left="720" w:hanging="360"/>
+      </w:pPr>
+    </w:lvl>
+    <w:lvl w:ilvl="1" w:tentative="1">
+      <w:start w:val="1"/>
+      <w:numFmt w:val="decimal"/>
+      <w:lvlText w:val="%2."/>
+      <w:lvlJc w:val="left"/>
+      <w:pPr>
+        <w:tabs>
+          <w:tab w:val="num" w:pos="1440"/>
+        </w:tabs>
+        <w:ind w:left="1440" w:hanging="360"/>
+      </w:pPr>
+    </w:lvl>
+    <w:lvl w:ilvl="2" w:tentative="1">
+      <w:start w:val="1"/>
+      <w:numFmt w:val="decimal"/>
+      <w:lvlText w:val="%3."/>
+      <w:lvlJc w:val="left"/>
+      <w:pPr>
+        <w:tabs>
+          <w:tab w:val="num" w:pos="2160"/>
+        </w:tabs>
+        <w:ind w:left="2160" w:hanging="360"/>
+      </w:pPr>
+    </w:lvl>
+    <w:lvl w:ilvl="3" w:tentative="1">
+      <w:start w:val="1"/>
+      <w:numFmt w:val="decimal"/>
+      <w:lvlText w:val="%4."/>
+      <w:lvlJc w:val="left"/>
+      <w:pPr>
+        <w:tabs>
+          <w:tab w:val="num" w:pos="2880"/>
+        </w:tabs>
+        <w:ind w:left="2880" w:hanging="360"/>
+      </w:pPr>
+    </w:lvl>
+    <w:lvl w:ilvl="4" w:tentative="1">
+      <w:start w:val="1"/>
+      <w:numFmt w:val="decimal"/>
+      <w:lvlText w:val="%5."/>
+      <w:lvlJc w:val="left"/>
+      <w:pPr>
+        <w:tabs>
+          <w:tab w:val="num" w:pos="3600"/>
+        </w:tabs>
+        <w:ind w:left="3600" w:hanging="360"/>
+      </w:pPr>
+    </w:lvl>
+    <w:lvl w:ilvl="5" w:tentative="1">
+      <w:start w:val="1"/>
+      <w:numFmt w:val="decimal"/>
+      <w:lvlText w:val="%6."/>
+      <w:lvlJc w:val="left"/>
+      <w:pPr>
+        <w:tabs>
+          <w:tab w:val="num" w:pos="4320"/>
+        </w:tabs>
+        <w:ind w:left="4320" w:hanging="360"/>
+      </w:pPr>
+    </w:lvl>
+    <w:lvl w:ilvl="6" w:tentative="1">
+      <w:start w:val="1"/>
+      <w:numFmt w:val="decimal"/>
+      <w:lvlText w:val="%7."/>
+      <w:lvlJc w:val="left"/>
+      <w:pPr>
+        <w:tabs>
+          <w:tab w:val="num" w:pos="5040"/>
+        </w:tabs>
+        <w:ind w:left="5040" w:hanging="360"/>
+      </w:pPr>
+    </w:lvl>
+    <w:lvl w:ilvl="7" w:tentative="1">
+      <w:start w:val="1"/>
+      <w:numFmt w:val="decimal"/>
+      <w:lvlText w:val="%8."/>
+      <w:lvlJc w:val="left"/>
+      <w:pPr>
+        <w:tabs>
+          <w:tab w:val="num" w:pos="5760"/>
+        </w:tabs>
+        <w:ind w:left="5760" w:hanging="360"/>
+      </w:pPr>
+    </w:lvl>
+    <w:lvl w:ilvl="8" w:tentative="1">
+      <w:start w:val="1"/>
+      <w:numFmt w:val="decimal"/>
+      <w:lvlText w:val="%9."/>
+      <w:lvlJc w:val="left"/>
+      <w:pPr>
+        <w:tabs>
+          <w:tab w:val="num" w:pos="6480"/>
+        </w:tabs>
+        <w:ind w:left="6480" w:hanging="360"/>
+      </w:pPr>
+    </w:lvl>
+  </w:abstractNum>
   <w:abstractNum w:abstractNumId="9" w15:restartNumberingAfterBreak="0">
-    <w:nsid w:val="42BF6830"/>
+    <w:nsid w:val="3B18424B"/>
     <w:multiLevelType w:val="multilevel"/>
-    <w:tmpl w:val="753E2AC4"/>
+    <w:tmpl w:val="F0AA48E8"/>
     <w:lvl w:ilvl="0">
       <w:start w:val="1"/>
       <w:numFmt w:val="decimal"/>
@@ -5802,9 +5801,9 @@
     </w:lvl>
   </w:abstractNum>
   <w:abstractNum w:abstractNumId="10" w15:restartNumberingAfterBreak="0">
-    <w:nsid w:val="4C063A8F"/>
+    <w:nsid w:val="49480117"/>
     <w:multiLevelType w:val="multilevel"/>
-    <w:tmpl w:val="863667EE"/>
+    <w:tmpl w:val="E1EA5F36"/>
     <w:lvl w:ilvl="0">
       <w:start w:val="1"/>
       <w:numFmt w:val="bullet"/>
@@ -5951,9 +5950,9 @@
     </w:lvl>
   </w:abstractNum>
   <w:abstractNum w:abstractNumId="11" w15:restartNumberingAfterBreak="0">
-    <w:nsid w:val="53E77B03"/>
+    <w:nsid w:val="4A0D0F3A"/>
     <w:multiLevelType w:val="multilevel"/>
-    <w:tmpl w:val="02F6F1B8"/>
+    <w:tmpl w:val="A9DCEC92"/>
     <w:lvl w:ilvl="0">
       <w:start w:val="1"/>
       <w:numFmt w:val="decimal"/>
@@ -6064,9 +6063,9 @@
     </w:lvl>
   </w:abstractNum>
   <w:abstractNum w:abstractNumId="12" w15:restartNumberingAfterBreak="0">
-    <w:nsid w:val="54EC1D9D"/>
+    <w:nsid w:val="550149E8"/>
     <w:multiLevelType w:val="multilevel"/>
-    <w:tmpl w:val="970C4800"/>
+    <w:tmpl w:val="FA60E268"/>
     <w:lvl w:ilvl="0">
       <w:start w:val="1"/>
       <w:numFmt w:val="bullet"/>
@@ -6213,9 +6212,9 @@
     </w:lvl>
   </w:abstractNum>
   <w:abstractNum w:abstractNumId="13" w15:restartNumberingAfterBreak="0">
-    <w:nsid w:val="5D4B57AF"/>
+    <w:nsid w:val="57D13208"/>
     <w:multiLevelType w:val="multilevel"/>
-    <w:tmpl w:val="354855F2"/>
+    <w:tmpl w:val="4712F3D0"/>
     <w:lvl w:ilvl="0">
       <w:start w:val="1"/>
       <w:numFmt w:val="decimal"/>
@@ -6326,9 +6325,9 @@
     </w:lvl>
   </w:abstractNum>
   <w:abstractNum w:abstractNumId="14" w15:restartNumberingAfterBreak="0">
-    <w:nsid w:val="67A14838"/>
+    <w:nsid w:val="6C233EA4"/>
     <w:multiLevelType w:val="multilevel"/>
-    <w:tmpl w:val="9D648CFA"/>
+    <w:tmpl w:val="AA865FA0"/>
     <w:lvl w:ilvl="0">
       <w:start w:val="1"/>
       <w:numFmt w:val="decimal"/>
@@ -6439,9 +6438,9 @@
     </w:lvl>
   </w:abstractNum>
   <w:abstractNum w:abstractNumId="15" w15:restartNumberingAfterBreak="0">
-    <w:nsid w:val="6B68434E"/>
+    <w:nsid w:val="6D84278A"/>
     <w:multiLevelType w:val="multilevel"/>
-    <w:tmpl w:val="B1C45326"/>
+    <w:tmpl w:val="1512B124"/>
     <w:lvl w:ilvl="0">
       <w:start w:val="1"/>
       <w:numFmt w:val="decimal"/>
@@ -6552,9 +6551,9 @@
     </w:lvl>
   </w:abstractNum>
   <w:abstractNum w:abstractNumId="16" w15:restartNumberingAfterBreak="0">
-    <w:nsid w:val="71077897"/>
+    <w:nsid w:val="72EE7510"/>
     <w:multiLevelType w:val="multilevel"/>
-    <w:tmpl w:val="0B2ACB5C"/>
+    <w:tmpl w:val="7BEC779C"/>
     <w:lvl w:ilvl="0">
       <w:start w:val="1"/>
       <w:numFmt w:val="decimal"/>
@@ -6664,56 +6663,56 @@
       </w:pPr>
     </w:lvl>
   </w:abstractNum>
-  <w:num w:numId="1" w16cid:durableId="823854648">
+  <w:num w:numId="1" w16cid:durableId="1294825950">
+    <w:abstractNumId w:val="4"/>
+  </w:num>
+  <w:num w:numId="2" w16cid:durableId="1763335397">
+    <w:abstractNumId w:val="2"/>
+  </w:num>
+  <w:num w:numId="3" w16cid:durableId="719012785">
+    <w:abstractNumId w:val="0"/>
+  </w:num>
+  <w:num w:numId="4" w16cid:durableId="704866873">
+    <w:abstractNumId w:val="3"/>
+  </w:num>
+  <w:num w:numId="5" w16cid:durableId="21633143">
+    <w:abstractNumId w:val="14"/>
+  </w:num>
+  <w:num w:numId="6" w16cid:durableId="1492479814">
+    <w:abstractNumId w:val="6"/>
+  </w:num>
+  <w:num w:numId="7" w16cid:durableId="156389926">
+    <w:abstractNumId w:val="1"/>
+  </w:num>
+  <w:num w:numId="8" w16cid:durableId="422654593">
+    <w:abstractNumId w:val="11"/>
+  </w:num>
+  <w:num w:numId="9" w16cid:durableId="897979016">
+    <w:abstractNumId w:val="7"/>
+  </w:num>
+  <w:num w:numId="10" w16cid:durableId="1935630368">
     <w:abstractNumId w:val="5"/>
   </w:num>
-  <w:num w:numId="2" w16cid:durableId="1980529718">
+  <w:num w:numId="11" w16cid:durableId="816339419">
+    <w:abstractNumId w:val="15"/>
+  </w:num>
+  <w:num w:numId="12" w16cid:durableId="248077295">
+    <w:abstractNumId w:val="16"/>
+  </w:num>
+  <w:num w:numId="13" w16cid:durableId="585846334">
+    <w:abstractNumId w:val="8"/>
+  </w:num>
+  <w:num w:numId="14" w16cid:durableId="451754949">
+    <w:abstractNumId w:val="13"/>
+  </w:num>
+  <w:num w:numId="15" w16cid:durableId="1001662605">
     <w:abstractNumId w:val="9"/>
   </w:num>
-  <w:num w:numId="3" w16cid:durableId="500395180">
-    <w:abstractNumId w:val="0"/>
-  </w:num>
-  <w:num w:numId="4" w16cid:durableId="1900281865">
-    <w:abstractNumId w:val="8"/>
-  </w:num>
-  <w:num w:numId="5" w16cid:durableId="1356733416">
-    <w:abstractNumId w:val="3"/>
-  </w:num>
-  <w:num w:numId="6" w16cid:durableId="807166645">
-    <w:abstractNumId w:val="7"/>
-  </w:num>
-  <w:num w:numId="7" w16cid:durableId="1451246201">
-    <w:abstractNumId w:val="11"/>
-  </w:num>
-  <w:num w:numId="8" w16cid:durableId="745223413">
-    <w:abstractNumId w:val="15"/>
-  </w:num>
-  <w:num w:numId="9" w16cid:durableId="1203135434">
-    <w:abstractNumId w:val="10"/>
-  </w:num>
-  <w:num w:numId="10" w16cid:durableId="1402558947">
-    <w:abstractNumId w:val="1"/>
-  </w:num>
-  <w:num w:numId="11" w16cid:durableId="1859807497">
-    <w:abstractNumId w:val="4"/>
-  </w:num>
-  <w:num w:numId="12" w16cid:durableId="1559514641">
-    <w:abstractNumId w:val="13"/>
-  </w:num>
-  <w:num w:numId="13" w16cid:durableId="1753351087">
-    <w:abstractNumId w:val="2"/>
-  </w:num>
-  <w:num w:numId="14" w16cid:durableId="1737050886">
-    <w:abstractNumId w:val="14"/>
-  </w:num>
-  <w:num w:numId="15" w16cid:durableId="57943210">
-    <w:abstractNumId w:val="16"/>
-  </w:num>
-  <w:num w:numId="16" w16cid:durableId="1224413702">
+  <w:num w:numId="16" w16cid:durableId="693456932">
     <w:abstractNumId w:val="12"/>
   </w:num>
-  <w:num w:numId="17" w16cid:durableId="1175730665">
-    <w:abstractNumId w:val="6"/>
+  <w:num w:numId="17" w16cid:durableId="2036733171">
+    <w:abstractNumId w:val="10"/>
   </w:num>
 </w:numbering>
 </file>

</xml_diff>